<commit_message>
Complete chatbot and topics improvements: tasks 3, 4, 7-10, 21-23
Chatbot:
- Hardcode name to Luno everywhere, remove name edit from settings
- Add age-based tone and temperature by age bracket
- Enforce open-ended questions, context-aware response length
- Add markdown rendering with react-markdown and remark-gfm
- Add 4 character-colored suggestion buttons
- Fix auto-scroll on new messages

Topics:
- Rename Add Post to Add Content
- AI guardrails for age-appropriate content
- IB curriculum: 8 categories, 62 topics
- Enhanced AI generation: structured mini-lessons, 500-1000 words
- Fix JSON parser, increase content limit, add collapsible posts
- Cap child age at 14
- Update roadmap: 9 of 23 tasks complete
</commit_message>
<xml_diff>
--- a/docs/Yoluno_Development_Roadmap.docx
+++ b/docs/Yoluno_Development_Roadmap.docx
@@ -201,13 +201,14 @@
       <w:tr>
         <w:tc>
           <w:tcPr>
-            <w:vAlign w:val="center"/>
-          </w:tcPr>
-          <w:p>
-            <w:r>
-              <w:rPr>
-                <w:rFonts w:ascii="Segoe UI" w:cs="Segoe UI" w:eastAsia="Segoe UI" w:hAnsi="Segoe UI"/>
-                <w:color w:val="2D2A26"/>
+            <w:shd w:color="D4EDDA" w:val="solid"/>
+            <w:vAlign w:val="center"/>
+          </w:tcPr>
+          <w:p>
+            <w:r>
+              <w:rPr>
+                <w:rFonts w:ascii="Segoe UI" w:cs="Segoe UI" w:eastAsia="Segoe UI" w:hAnsi="Segoe UI"/>
+                <w:color w:val="155724"/>
                 <w:sz w:val="20"/>
                 <w:szCs w:val="20"/>
               </w:rPr>
@@ -217,13 +218,14 @@
         </w:tc>
         <w:tc>
           <w:tcPr>
-            <w:vAlign w:val="center"/>
-          </w:tcPr>
-          <w:p>
-            <w:r>
-              <w:rPr>
-                <w:rFonts w:ascii="Segoe UI" w:cs="Segoe UI" w:eastAsia="Segoe UI" w:hAnsi="Segoe UI"/>
-                <w:color w:val="2D2A26"/>
+            <w:shd w:color="D4EDDA" w:val="solid"/>
+            <w:vAlign w:val="center"/>
+          </w:tcPr>
+          <w:p>
+            <w:r>
+              <w:rPr>
+                <w:rFonts w:ascii="Segoe UI" w:cs="Segoe UI" w:eastAsia="Segoe UI" w:hAnsi="Segoe UI"/>
+                <w:color w:val="155724"/>
                 <w:sz w:val="20"/>
                 <w:szCs w:val="20"/>
               </w:rPr>
@@ -233,13 +235,14 @@
         </w:tc>
         <w:tc>
           <w:tcPr>
-            <w:vAlign w:val="center"/>
-          </w:tcPr>
-          <w:p>
-            <w:r>
-              <w:rPr>
-                <w:rFonts w:ascii="Segoe UI" w:cs="Segoe UI" w:eastAsia="Segoe UI" w:hAnsi="Segoe UI"/>
-                <w:color w:val="2D2A26"/>
+            <w:shd w:color="D4EDDA" w:val="solid"/>
+            <w:vAlign w:val="center"/>
+          </w:tcPr>
+          <w:p>
+            <w:r>
+              <w:rPr>
+                <w:rFonts w:ascii="Segoe UI" w:cs="Segoe UI" w:eastAsia="Segoe UI" w:hAnsi="Segoe UI"/>
+                <w:color w:val="155724"/>
                 <w:sz w:val="20"/>
                 <w:szCs w:val="20"/>
               </w:rPr>
@@ -249,13 +252,14 @@
         </w:tc>
         <w:tc>
           <w:tcPr>
-            <w:vAlign w:val="center"/>
-          </w:tcPr>
-          <w:p>
-            <w:r>
-              <w:rPr>
-                <w:rFonts w:ascii="Segoe UI" w:cs="Segoe UI" w:eastAsia="Segoe UI" w:hAnsi="Segoe UI"/>
-                <w:color w:val="2D2A26"/>
+            <w:shd w:color="D4EDDA" w:val="solid"/>
+            <w:vAlign w:val="center"/>
+          </w:tcPr>
+          <w:p>
+            <w:r>
+              <w:rPr>
+                <w:rFonts w:ascii="Segoe UI" w:cs="Segoe UI" w:eastAsia="Segoe UI" w:hAnsi="Segoe UI"/>
+                <w:color w:val="155724"/>
                 <w:sz w:val="20"/>
                 <w:szCs w:val="20"/>
               </w:rPr>
@@ -265,6 +269,7 @@
         </w:tc>
         <w:tc>
           <w:tcPr>
+            <w:shd w:color="D4EDDA" w:val="solid"/>
             <w:vAlign w:val="center"/>
           </w:tcPr>
           <w:p>
@@ -277,7 +282,7 @@
                 <w:sz w:val="20"/>
                 <w:szCs w:val="20"/>
               </w:rPr>
-              <w:t xml:space="preserve"/>
+              <w:t xml:space="preserve">✅</w:t>
             </w:r>
           </w:p>
         </w:tc>
@@ -2202,13 +2207,14 @@
       <w:tr>
         <w:tc>
           <w:tcPr>
-            <w:vAlign w:val="center"/>
-          </w:tcPr>
-          <w:p>
-            <w:r>
-              <w:rPr>
-                <w:rFonts w:ascii="Segoe UI" w:cs="Segoe UI" w:eastAsia="Segoe UI" w:hAnsi="Segoe UI"/>
-                <w:color w:val="2D2A26"/>
+            <w:shd w:color="D4EDDA" w:val="solid"/>
+            <w:vAlign w:val="center"/>
+          </w:tcPr>
+          <w:p>
+            <w:r>
+              <w:rPr>
+                <w:rFonts w:ascii="Segoe UI" w:cs="Segoe UI" w:eastAsia="Segoe UI" w:hAnsi="Segoe UI"/>
+                <w:color w:val="155724"/>
                 <w:sz w:val="20"/>
                 <w:szCs w:val="20"/>
               </w:rPr>
@@ -2218,13 +2224,14 @@
         </w:tc>
         <w:tc>
           <w:tcPr>
-            <w:vAlign w:val="center"/>
-          </w:tcPr>
-          <w:p>
-            <w:r>
-              <w:rPr>
-                <w:rFonts w:ascii="Segoe UI" w:cs="Segoe UI" w:eastAsia="Segoe UI" w:hAnsi="Segoe UI"/>
-                <w:color w:val="2D2A26"/>
+            <w:shd w:color="D4EDDA" w:val="solid"/>
+            <w:vAlign w:val="center"/>
+          </w:tcPr>
+          <w:p>
+            <w:r>
+              <w:rPr>
+                <w:rFonts w:ascii="Segoe UI" w:cs="Segoe UI" w:eastAsia="Segoe UI" w:hAnsi="Segoe UI"/>
+                <w:color w:val="155724"/>
                 <w:sz w:val="20"/>
                 <w:szCs w:val="20"/>
               </w:rPr>
@@ -2234,13 +2241,14 @@
         </w:tc>
         <w:tc>
           <w:tcPr>
-            <w:vAlign w:val="center"/>
-          </w:tcPr>
-          <w:p>
-            <w:r>
-              <w:rPr>
-                <w:rFonts w:ascii="Segoe UI" w:cs="Segoe UI" w:eastAsia="Segoe UI" w:hAnsi="Segoe UI"/>
-                <w:color w:val="2D2A26"/>
+            <w:shd w:color="D4EDDA" w:val="solid"/>
+            <w:vAlign w:val="center"/>
+          </w:tcPr>
+          <w:p>
+            <w:r>
+              <w:rPr>
+                <w:rFonts w:ascii="Segoe UI" w:cs="Segoe UI" w:eastAsia="Segoe UI" w:hAnsi="Segoe UI"/>
+                <w:color w:val="155724"/>
                 <w:sz w:val="20"/>
                 <w:szCs w:val="20"/>
               </w:rPr>
@@ -2250,13 +2258,14 @@
         </w:tc>
         <w:tc>
           <w:tcPr>
-            <w:vAlign w:val="center"/>
-          </w:tcPr>
-          <w:p>
-            <w:r>
-              <w:rPr>
-                <w:rFonts w:ascii="Segoe UI" w:cs="Segoe UI" w:eastAsia="Segoe UI" w:hAnsi="Segoe UI"/>
-                <w:color w:val="2D2A26"/>
+            <w:shd w:color="D4EDDA" w:val="solid"/>
+            <w:vAlign w:val="center"/>
+          </w:tcPr>
+          <w:p>
+            <w:r>
+              <w:rPr>
+                <w:rFonts w:ascii="Segoe UI" w:cs="Segoe UI" w:eastAsia="Segoe UI" w:hAnsi="Segoe UI"/>
+                <w:color w:val="155724"/>
                 <w:sz w:val="20"/>
                 <w:szCs w:val="20"/>
               </w:rPr>
@@ -2266,6 +2275,7 @@
         </w:tc>
         <w:tc>
           <w:tcPr>
+            <w:shd w:color="D4EDDA" w:val="solid"/>
             <w:vAlign w:val="center"/>
           </w:tcPr>
           <w:p>
@@ -2278,7 +2288,7 @@
                 <w:sz w:val="20"/>
                 <w:szCs w:val="20"/>
               </w:rPr>
-              <w:t xml:space="preserve"/>
+              <w:t xml:space="preserve">✅</w:t>
             </w:r>
           </w:p>
         </w:tc>
@@ -2286,14 +2296,14 @@
       <w:tr>
         <w:tc>
           <w:tcPr>
-            <w:shd w:color="F5F4F2" w:val="solid"/>
-            <w:vAlign w:val="center"/>
-          </w:tcPr>
-          <w:p>
-            <w:r>
-              <w:rPr>
-                <w:rFonts w:ascii="Segoe UI" w:cs="Segoe UI" w:eastAsia="Segoe UI" w:hAnsi="Segoe UI"/>
-                <w:color w:val="2D2A26"/>
+            <w:shd w:color="D4EDDA" w:val="solid"/>
+            <w:vAlign w:val="center"/>
+          </w:tcPr>
+          <w:p>
+            <w:r>
+              <w:rPr>
+                <w:rFonts w:ascii="Segoe UI" w:cs="Segoe UI" w:eastAsia="Segoe UI" w:hAnsi="Segoe UI"/>
+                <w:color w:val="155724"/>
                 <w:sz w:val="20"/>
                 <w:szCs w:val="20"/>
               </w:rPr>
@@ -2303,14 +2313,14 @@
         </w:tc>
         <w:tc>
           <w:tcPr>
-            <w:shd w:color="F5F4F2" w:val="solid"/>
-            <w:vAlign w:val="center"/>
-          </w:tcPr>
-          <w:p>
-            <w:r>
-              <w:rPr>
-                <w:rFonts w:ascii="Segoe UI" w:cs="Segoe UI" w:eastAsia="Segoe UI" w:hAnsi="Segoe UI"/>
-                <w:color w:val="2D2A26"/>
+            <w:shd w:color="D4EDDA" w:val="solid"/>
+            <w:vAlign w:val="center"/>
+          </w:tcPr>
+          <w:p>
+            <w:r>
+              <w:rPr>
+                <w:rFonts w:ascii="Segoe UI" w:cs="Segoe UI" w:eastAsia="Segoe UI" w:hAnsi="Segoe UI"/>
+                <w:color w:val="155724"/>
                 <w:sz w:val="20"/>
                 <w:szCs w:val="20"/>
               </w:rPr>
@@ -2320,14 +2330,14 @@
         </w:tc>
         <w:tc>
           <w:tcPr>
-            <w:shd w:color="F5F4F2" w:val="solid"/>
-            <w:vAlign w:val="center"/>
-          </w:tcPr>
-          <w:p>
-            <w:r>
-              <w:rPr>
-                <w:rFonts w:ascii="Segoe UI" w:cs="Segoe UI" w:eastAsia="Segoe UI" w:hAnsi="Segoe UI"/>
-                <w:color w:val="2D2A26"/>
+            <w:shd w:color="D4EDDA" w:val="solid"/>
+            <w:vAlign w:val="center"/>
+          </w:tcPr>
+          <w:p>
+            <w:r>
+              <w:rPr>
+                <w:rFonts w:ascii="Segoe UI" w:cs="Segoe UI" w:eastAsia="Segoe UI" w:hAnsi="Segoe UI"/>
+                <w:color w:val="155724"/>
                 <w:sz w:val="20"/>
                 <w:szCs w:val="20"/>
               </w:rPr>
@@ -2337,14 +2347,14 @@
         </w:tc>
         <w:tc>
           <w:tcPr>
-            <w:shd w:color="F5F4F2" w:val="solid"/>
-            <w:vAlign w:val="center"/>
-          </w:tcPr>
-          <w:p>
-            <w:r>
-              <w:rPr>
-                <w:rFonts w:ascii="Segoe UI" w:cs="Segoe UI" w:eastAsia="Segoe UI" w:hAnsi="Segoe UI"/>
-                <w:color w:val="2D2A26"/>
+            <w:shd w:color="D4EDDA" w:val="solid"/>
+            <w:vAlign w:val="center"/>
+          </w:tcPr>
+          <w:p>
+            <w:r>
+              <w:rPr>
+                <w:rFonts w:ascii="Segoe UI" w:cs="Segoe UI" w:eastAsia="Segoe UI" w:hAnsi="Segoe UI"/>
+                <w:color w:val="155724"/>
                 <w:sz w:val="20"/>
                 <w:szCs w:val="20"/>
               </w:rPr>
@@ -2354,7 +2364,7 @@
         </w:tc>
         <w:tc>
           <w:tcPr>
-            <w:shd w:color="F5F4F2" w:val="solid"/>
+            <w:shd w:color="D4EDDA" w:val="solid"/>
             <w:vAlign w:val="center"/>
           </w:tcPr>
           <w:p>
@@ -2367,7 +2377,7 @@
                 <w:sz w:val="20"/>
                 <w:szCs w:val="20"/>
               </w:rPr>
-              <w:t xml:space="preserve"/>
+              <w:t xml:space="preserve">✅</w:t>
             </w:r>
           </w:p>
         </w:tc>
@@ -2375,13 +2385,14 @@
       <w:tr>
         <w:tc>
           <w:tcPr>
-            <w:vAlign w:val="center"/>
-          </w:tcPr>
-          <w:p>
-            <w:r>
-              <w:rPr>
-                <w:rFonts w:ascii="Segoe UI" w:cs="Segoe UI" w:eastAsia="Segoe UI" w:hAnsi="Segoe UI"/>
-                <w:color w:val="2D2A26"/>
+            <w:shd w:color="D4EDDA" w:val="solid"/>
+            <w:vAlign w:val="center"/>
+          </w:tcPr>
+          <w:p>
+            <w:r>
+              <w:rPr>
+                <w:rFonts w:ascii="Segoe UI" w:cs="Segoe UI" w:eastAsia="Segoe UI" w:hAnsi="Segoe UI"/>
+                <w:color w:val="155724"/>
                 <w:sz w:val="20"/>
                 <w:szCs w:val="20"/>
               </w:rPr>
@@ -2391,13 +2402,14 @@
         </w:tc>
         <w:tc>
           <w:tcPr>
-            <w:vAlign w:val="center"/>
-          </w:tcPr>
-          <w:p>
-            <w:r>
-              <w:rPr>
-                <w:rFonts w:ascii="Segoe UI" w:cs="Segoe UI" w:eastAsia="Segoe UI" w:hAnsi="Segoe UI"/>
-                <w:color w:val="2D2A26"/>
+            <w:shd w:color="D4EDDA" w:val="solid"/>
+            <w:vAlign w:val="center"/>
+          </w:tcPr>
+          <w:p>
+            <w:r>
+              <w:rPr>
+                <w:rFonts w:ascii="Segoe UI" w:cs="Segoe UI" w:eastAsia="Segoe UI" w:hAnsi="Segoe UI"/>
+                <w:color w:val="155724"/>
                 <w:sz w:val="20"/>
                 <w:szCs w:val="20"/>
               </w:rPr>
@@ -2407,13 +2419,14 @@
         </w:tc>
         <w:tc>
           <w:tcPr>
-            <w:vAlign w:val="center"/>
-          </w:tcPr>
-          <w:p>
-            <w:r>
-              <w:rPr>
-                <w:rFonts w:ascii="Segoe UI" w:cs="Segoe UI" w:eastAsia="Segoe UI" w:hAnsi="Segoe UI"/>
-                <w:color w:val="2D2A26"/>
+            <w:shd w:color="D4EDDA" w:val="solid"/>
+            <w:vAlign w:val="center"/>
+          </w:tcPr>
+          <w:p>
+            <w:r>
+              <w:rPr>
+                <w:rFonts w:ascii="Segoe UI" w:cs="Segoe UI" w:eastAsia="Segoe UI" w:hAnsi="Segoe UI"/>
+                <w:color w:val="155724"/>
                 <w:sz w:val="20"/>
                 <w:szCs w:val="20"/>
               </w:rPr>
@@ -2423,13 +2436,14 @@
         </w:tc>
         <w:tc>
           <w:tcPr>
-            <w:vAlign w:val="center"/>
-          </w:tcPr>
-          <w:p>
-            <w:r>
-              <w:rPr>
-                <w:rFonts w:ascii="Segoe UI" w:cs="Segoe UI" w:eastAsia="Segoe UI" w:hAnsi="Segoe UI"/>
-                <w:color w:val="2D2A26"/>
+            <w:shd w:color="D4EDDA" w:val="solid"/>
+            <w:vAlign w:val="center"/>
+          </w:tcPr>
+          <w:p>
+            <w:r>
+              <w:rPr>
+                <w:rFonts w:ascii="Segoe UI" w:cs="Segoe UI" w:eastAsia="Segoe UI" w:hAnsi="Segoe UI"/>
+                <w:color w:val="155724"/>
                 <w:sz w:val="20"/>
                 <w:szCs w:val="20"/>
               </w:rPr>
@@ -2439,6 +2453,7 @@
         </w:tc>
         <w:tc>
           <w:tcPr>
+            <w:shd w:color="D4EDDA" w:val="solid"/>
             <w:vAlign w:val="center"/>
           </w:tcPr>
           <w:p>
@@ -2451,1080 +2466,12 @@
                 <w:sz w:val="20"/>
                 <w:szCs w:val="20"/>
               </w:rPr>
-              <w:t xml:space="preserve"/>
+              <w:t xml:space="preserve">✅</w:t>
             </w:r>
           </w:p>
         </w:tc>
       </w:tr>
     </w:tbl>
-    <w:p>
-      <w:pPr>
-        <w:spacing w:after="100" w:before="100"/>
-      </w:pPr>
-    </w:p>
-    <w:p>
-      <w:pPr>
-        <w:pStyle w:val="Heading2"/>
-        <w:spacing w:after="100" w:before="300"/>
-      </w:pPr>
-      <w:r>
-        <w:rPr>
-          <w:rFonts w:ascii="Segoe UI" w:cs="Segoe UI" w:eastAsia="Segoe UI" w:hAnsi="Segoe UI"/>
-          <w:b/>
-          <w:bCs/>
-          <w:color w:val="2D2A26"/>
-        </w:rPr>
-        <w:t xml:space="preserve">Task 23 Detail: Enhanced AI Topic Generation</w:t>
-      </w:r>
-    </w:p>
-    <w:p>
-      <w:pPr>
-        <w:spacing w:after="100"/>
-      </w:pPr>
-      <w:r>
-        <w:rPr>
-          <w:rFonts w:ascii="Segoe UI" w:cs="Segoe UI" w:eastAsia="Segoe UI" w:hAnsi="Segoe UI"/>
-          <w:color w:val="2D2A26"/>
-          <w:sz w:val="20"/>
-          <w:szCs w:val="20"/>
-        </w:rPr>
-        <w:t xml:space="preserve">The current "Generate with AI" feature produces 100-200 word snippets with 2-4 facts. This is too short for meaningful learning. The upgrade transforms it into a structured mini-lesson generator.</w:t>
-      </w:r>
-    </w:p>
-    <w:p>
-      <w:pPr>
-        <w:spacing w:after="100" w:before="100"/>
-      </w:pPr>
-    </w:p>
-    <w:p>
-      <w:pPr>
-        <w:pStyle w:val="Heading3"/>
-        <w:spacing w:after="100" w:before="300"/>
-      </w:pPr>
-      <w:r>
-        <w:rPr>
-          <w:rFonts w:ascii="Segoe UI" w:cs="Segoe UI" w:eastAsia="Segoe UI" w:hAnsi="Segoe UI"/>
-          <w:b/>
-          <w:bCs/>
-          <w:color w:val="2D2A26"/>
-        </w:rPr>
-        <w:t xml:space="preserve">Current vs Proposed</w:t>
-      </w:r>
-    </w:p>
-    <w:tbl>
-      <w:tblPr>
-        <w:tblW w:type="pct" w:w="100%"/>
-        <w:tblBorders>
-          <w:top w:val="single" w:color="DDDDDD" w:sz="1"/>
-          <w:left w:val="single" w:color="DDDDDD" w:sz="1"/>
-          <w:bottom w:val="single" w:color="DDDDDD" w:sz="1"/>
-          <w:right w:val="single" w:color="DDDDDD" w:sz="1"/>
-          <w:insideH w:val="single" w:color="DDDDDD" w:sz="1"/>
-          <w:insideV w:val="single" w:color="DDDDDD" w:sz="1"/>
-        </w:tblBorders>
-      </w:tblPr>
-      <w:tblGrid>
-        <w:gridCol w:w="100"/>
-        <w:gridCol w:w="100"/>
-        <w:gridCol w:w="100"/>
-        <w:gridCol w:w="100"/>
-      </w:tblGrid>
-      <w:tr>
-        <w:tc>
-          <w:tcPr>
-            <w:shd w:color="3DD6C8" w:val="solid"/>
-            <w:vAlign w:val="center"/>
-          </w:tcPr>
-          <w:p>
-            <w:r>
-              <w:rPr>
-                <w:rFonts w:ascii="Segoe UI" w:cs="Segoe UI" w:eastAsia="Segoe UI" w:hAnsi="Segoe UI"/>
-                <w:b/>
-                <w:bCs/>
-                <w:color w:val="FFFFFF"/>
-                <w:sz w:val="20"/>
-                <w:szCs w:val="20"/>
-              </w:rPr>
-              <w:t xml:space="preserve">Aspect</w:t>
-            </w:r>
-          </w:p>
-        </w:tc>
-        <w:tc>
-          <w:tcPr>
-            <w:shd w:color="3DD6C8" w:val="solid"/>
-            <w:vAlign w:val="center"/>
-          </w:tcPr>
-          <w:p>
-            <w:r>
-              <w:rPr>
-                <w:rFonts w:ascii="Segoe UI" w:cs="Segoe UI" w:eastAsia="Segoe UI" w:hAnsi="Segoe UI"/>
-                <w:b/>
-                <w:bCs/>
-                <w:color w:val="FFFFFF"/>
-                <w:sz w:val="20"/>
-                <w:szCs w:val="20"/>
-              </w:rPr>
-              <w:t xml:space="preserve">Current</w:t>
-            </w:r>
-          </w:p>
-        </w:tc>
-        <w:tc>
-          <w:tcPr>
-            <w:shd w:color="3DD6C8" w:val="solid"/>
-            <w:vAlign w:val="center"/>
-          </w:tcPr>
-          <w:p>
-            <w:r>
-              <w:rPr>
-                <w:rFonts w:ascii="Segoe UI" w:cs="Segoe UI" w:eastAsia="Segoe UI" w:hAnsi="Segoe UI"/>
-                <w:b/>
-                <w:bCs/>
-                <w:color w:val="FFFFFF"/>
-                <w:sz w:val="20"/>
-                <w:szCs w:val="20"/>
-              </w:rPr>
-              <w:t xml:space="preserve">Proposed</w:t>
-            </w:r>
-          </w:p>
-        </w:tc>
-        <w:tc>
-          <w:tcPr>
-            <w:shd w:color="3DD6C8" w:val="solid"/>
-            <w:vAlign w:val="center"/>
-          </w:tcPr>
-          <w:p>
-            <w:r>
-              <w:rPr>
-                <w:rFonts w:ascii="Segoe UI" w:cs="Segoe UI" w:eastAsia="Segoe UI" w:hAnsi="Segoe UI"/>
-                <w:b/>
-                <w:bCs/>
-                <w:color w:val="FFFFFF"/>
-                <w:sz w:val="20"/>
-                <w:szCs w:val="20"/>
-              </w:rPr>
-              <w:t xml:space="preserve">Status</w:t>
-            </w:r>
-          </w:p>
-        </w:tc>
-      </w:tr>
-      <w:tr>
-        <w:tc>
-          <w:tcPr>
-            <w:vAlign w:val="center"/>
-          </w:tcPr>
-          <w:p>
-            <w:r>
-              <w:rPr>
-                <w:rFonts w:ascii="Segoe UI" w:cs="Segoe UI" w:eastAsia="Segoe UI" w:hAnsi="Segoe UI"/>
-                <w:color w:val="2D2A26"/>
-                <w:sz w:val="20"/>
-                <w:szCs w:val="20"/>
-              </w:rPr>
-              <w:t xml:space="preserve">Word count</w:t>
-            </w:r>
-          </w:p>
-        </w:tc>
-        <w:tc>
-          <w:tcPr>
-            <w:vAlign w:val="center"/>
-          </w:tcPr>
-          <w:p>
-            <w:r>
-              <w:rPr>
-                <w:rFonts w:ascii="Segoe UI" w:cs="Segoe UI" w:eastAsia="Segoe UI" w:hAnsi="Segoe UI"/>
-                <w:color w:val="2D2A26"/>
-                <w:sz w:val="20"/>
-                <w:szCs w:val="20"/>
-              </w:rPr>
-              <w:t xml:space="preserve">100-200 words</w:t>
-            </w:r>
-          </w:p>
-        </w:tc>
-        <w:tc>
-          <w:tcPr>
-            <w:vAlign w:val="center"/>
-          </w:tcPr>
-          <w:p>
-            <w:r>
-              <w:rPr>
-                <w:rFonts w:ascii="Segoe UI" w:cs="Segoe UI" w:eastAsia="Segoe UI" w:hAnsi="Segoe UI"/>
-                <w:color w:val="2D2A26"/>
-                <w:sz w:val="20"/>
-                <w:szCs w:val="20"/>
-              </w:rPr>
-              <w:t xml:space="preserve">500-1000 words</w:t>
-            </w:r>
-          </w:p>
-        </w:tc>
-        <w:tc>
-          <w:tcPr>
-            <w:vAlign w:val="center"/>
-          </w:tcPr>
-          <w:p>
-            <w:pPr>
-              <w:jc w:val="center"/>
-            </w:pPr>
-            <w:r>
-              <w:rPr>
-                <w:rFonts w:ascii="Segoe UI" w:cs="Segoe UI" w:eastAsia="Segoe UI" w:hAnsi="Segoe UI"/>
-                <w:sz w:val="20"/>
-                <w:szCs w:val="20"/>
-              </w:rPr>
-              <w:t xml:space="preserve"/>
-            </w:r>
-          </w:p>
-        </w:tc>
-      </w:tr>
-      <w:tr>
-        <w:tc>
-          <w:tcPr>
-            <w:shd w:color="F5F4F2" w:val="solid"/>
-            <w:vAlign w:val="center"/>
-          </w:tcPr>
-          <w:p>
-            <w:r>
-              <w:rPr>
-                <w:rFonts w:ascii="Segoe UI" w:cs="Segoe UI" w:eastAsia="Segoe UI" w:hAnsi="Segoe UI"/>
-                <w:color w:val="2D2A26"/>
-                <w:sz w:val="20"/>
-                <w:szCs w:val="20"/>
-              </w:rPr>
-              <w:t xml:space="preserve">Structure</w:t>
-            </w:r>
-          </w:p>
-        </w:tc>
-        <w:tc>
-          <w:tcPr>
-            <w:shd w:color="F5F4F2" w:val="solid"/>
-            <w:vAlign w:val="center"/>
-          </w:tcPr>
-          <w:p>
-            <w:r>
-              <w:rPr>
-                <w:rFonts w:ascii="Segoe UI" w:cs="Segoe UI" w:eastAsia="Segoe UI" w:hAnsi="Segoe UI"/>
-                <w:color w:val="2D2A26"/>
-                <w:sz w:val="20"/>
-                <w:szCs w:val="20"/>
-              </w:rPr>
-              <w:t xml:space="preserve">Flat paragraph of facts</w:t>
-            </w:r>
-          </w:p>
-        </w:tc>
-        <w:tc>
-          <w:tcPr>
-            <w:shd w:color="F5F4F2" w:val="solid"/>
-            <w:vAlign w:val="center"/>
-          </w:tcPr>
-          <w:p>
-            <w:r>
-              <w:rPr>
-                <w:rFonts w:ascii="Segoe UI" w:cs="Segoe UI" w:eastAsia="Segoe UI" w:hAnsi="Segoe UI"/>
-                <w:color w:val="2D2A26"/>
-                <w:sz w:val="20"/>
-                <w:szCs w:val="20"/>
-              </w:rPr>
-              <w:t xml:space="preserve">Sections: Introduction, Key Concepts (3-5), Fun Facts, Did You Know, Try This</w:t>
-            </w:r>
-          </w:p>
-        </w:tc>
-        <w:tc>
-          <w:tcPr>
-            <w:shd w:color="F5F4F2" w:val="solid"/>
-            <w:vAlign w:val="center"/>
-          </w:tcPr>
-          <w:p>
-            <w:pPr>
-              <w:jc w:val="center"/>
-            </w:pPr>
-            <w:r>
-              <w:rPr>
-                <w:rFonts w:ascii="Segoe UI" w:cs="Segoe UI" w:eastAsia="Segoe UI" w:hAnsi="Segoe UI"/>
-                <w:sz w:val="20"/>
-                <w:szCs w:val="20"/>
-              </w:rPr>
-              <w:t xml:space="preserve"/>
-            </w:r>
-          </w:p>
-        </w:tc>
-      </w:tr>
-      <w:tr>
-        <w:tc>
-          <w:tcPr>
-            <w:vAlign w:val="center"/>
-          </w:tcPr>
-          <w:p>
-            <w:r>
-              <w:rPr>
-                <w:rFonts w:ascii="Segoe UI" w:cs="Segoe UI" w:eastAsia="Segoe UI" w:hAnsi="Segoe UI"/>
-                <w:color w:val="2D2A26"/>
-                <w:sz w:val="20"/>
-                <w:szCs w:val="20"/>
-              </w:rPr>
-              <w:t xml:space="preserve">max_tokens</w:t>
-            </w:r>
-          </w:p>
-        </w:tc>
-        <w:tc>
-          <w:tcPr>
-            <w:vAlign w:val="center"/>
-          </w:tcPr>
-          <w:p>
-            <w:r>
-              <w:rPr>
-                <w:rFonts w:ascii="Segoe UI" w:cs="Segoe UI" w:eastAsia="Segoe UI" w:hAnsi="Segoe UI"/>
-                <w:color w:val="2D2A26"/>
-                <w:sz w:val="20"/>
-                <w:szCs w:val="20"/>
-              </w:rPr>
-              <w:t xml:space="preserve">500</w:t>
-            </w:r>
-          </w:p>
-        </w:tc>
-        <w:tc>
-          <w:tcPr>
-            <w:vAlign w:val="center"/>
-          </w:tcPr>
-          <w:p>
-            <w:r>
-              <w:rPr>
-                <w:rFonts w:ascii="Segoe UI" w:cs="Segoe UI" w:eastAsia="Segoe UI" w:hAnsi="Segoe UI"/>
-                <w:color w:val="2D2A26"/>
-                <w:sz w:val="20"/>
-                <w:szCs w:val="20"/>
-              </w:rPr>
-              <w:t xml:space="preserve">2000</w:t>
-            </w:r>
-          </w:p>
-        </w:tc>
-        <w:tc>
-          <w:tcPr>
-            <w:vAlign w:val="center"/>
-          </w:tcPr>
-          <w:p>
-            <w:pPr>
-              <w:jc w:val="center"/>
-            </w:pPr>
-            <w:r>
-              <w:rPr>
-                <w:rFonts w:ascii="Segoe UI" w:cs="Segoe UI" w:eastAsia="Segoe UI" w:hAnsi="Segoe UI"/>
-                <w:sz w:val="20"/>
-                <w:szCs w:val="20"/>
-              </w:rPr>
-              <w:t xml:space="preserve"/>
-            </w:r>
-          </w:p>
-        </w:tc>
-      </w:tr>
-      <w:tr>
-        <w:tc>
-          <w:tcPr>
-            <w:shd w:color="F5F4F2" w:val="solid"/>
-            <w:vAlign w:val="center"/>
-          </w:tcPr>
-          <w:p>
-            <w:r>
-              <w:rPr>
-                <w:rFonts w:ascii="Segoe UI" w:cs="Segoe UI" w:eastAsia="Segoe UI" w:hAnsi="Segoe UI"/>
-                <w:color w:val="2D2A26"/>
-                <w:sz w:val="20"/>
-                <w:szCs w:val="20"/>
-              </w:rPr>
-              <w:t xml:space="preserve">Age range</w:t>
-            </w:r>
-          </w:p>
-        </w:tc>
-        <w:tc>
-          <w:tcPr>
-            <w:shd w:color="F5F4F2" w:val="solid"/>
-            <w:vAlign w:val="center"/>
-          </w:tcPr>
-          <w:p>
-            <w:r>
-              <w:rPr>
-                <w:rFonts w:ascii="Segoe UI" w:cs="Segoe UI" w:eastAsia="Segoe UI" w:hAnsi="Segoe UI"/>
-                <w:color w:val="2D2A26"/>
-                <w:sz w:val="20"/>
-                <w:szCs w:val="20"/>
-              </w:rPr>
-              <w:t xml:space="preserve">3-12 years</w:t>
-            </w:r>
-          </w:p>
-        </w:tc>
-        <w:tc>
-          <w:tcPr>
-            <w:shd w:color="F5F4F2" w:val="solid"/>
-            <w:vAlign w:val="center"/>
-          </w:tcPr>
-          <w:p>
-            <w:r>
-              <w:rPr>
-                <w:rFonts w:ascii="Segoe UI" w:cs="Segoe UI" w:eastAsia="Segoe UI" w:hAnsi="Segoe UI"/>
-                <w:color w:val="2D2A26"/>
-                <w:sz w:val="20"/>
-                <w:szCs w:val="20"/>
-              </w:rPr>
-              <w:t xml:space="preserve">3-14 years</w:t>
-            </w:r>
-          </w:p>
-        </w:tc>
-        <w:tc>
-          <w:tcPr>
-            <w:shd w:color="F5F4F2" w:val="solid"/>
-            <w:vAlign w:val="center"/>
-          </w:tcPr>
-          <w:p>
-            <w:pPr>
-              <w:jc w:val="center"/>
-            </w:pPr>
-            <w:r>
-              <w:rPr>
-                <w:rFonts w:ascii="Segoe UI" w:cs="Segoe UI" w:eastAsia="Segoe UI" w:hAnsi="Segoe UI"/>
-                <w:sz w:val="20"/>
-                <w:szCs w:val="20"/>
-              </w:rPr>
-              <w:t xml:space="preserve"/>
-            </w:r>
-          </w:p>
-        </w:tc>
-      </w:tr>
-      <w:tr>
-        <w:tc>
-          <w:tcPr>
-            <w:vAlign w:val="center"/>
-          </w:tcPr>
-          <w:p>
-            <w:r>
-              <w:rPr>
-                <w:rFonts w:ascii="Segoe UI" w:cs="Segoe UI" w:eastAsia="Segoe UI" w:hAnsi="Segoe UI"/>
-                <w:color w:val="2D2A26"/>
-                <w:sz w:val="20"/>
-                <w:szCs w:val="20"/>
-              </w:rPr>
-              <w:t xml:space="preserve">Model</w:t>
-            </w:r>
-          </w:p>
-        </w:tc>
-        <w:tc>
-          <w:tcPr>
-            <w:vAlign w:val="center"/>
-          </w:tcPr>
-          <w:p>
-            <w:r>
-              <w:rPr>
-                <w:rFonts w:ascii="Segoe UI" w:cs="Segoe UI" w:eastAsia="Segoe UI" w:hAnsi="Segoe UI"/>
-                <w:color w:val="2D2A26"/>
-                <w:sz w:val="20"/>
-                <w:szCs w:val="20"/>
-              </w:rPr>
-              <w:t xml:space="preserve">gemini-2.0-flash-001</w:t>
-            </w:r>
-          </w:p>
-        </w:tc>
-        <w:tc>
-          <w:tcPr>
-            <w:vAlign w:val="center"/>
-          </w:tcPr>
-          <w:p>
-            <w:r>
-              <w:rPr>
-                <w:rFonts w:ascii="Segoe UI" w:cs="Segoe UI" w:eastAsia="Segoe UI" w:hAnsi="Segoe UI"/>
-                <w:color w:val="2D2A26"/>
-                <w:sz w:val="20"/>
-                <w:szCs w:val="20"/>
-              </w:rPr>
-              <w:t xml:space="preserve">gemini-2.5-flash (latest)</w:t>
-            </w:r>
-          </w:p>
-        </w:tc>
-        <w:tc>
-          <w:tcPr>
-            <w:vAlign w:val="center"/>
-          </w:tcPr>
-          <w:p>
-            <w:pPr>
-              <w:jc w:val="center"/>
-            </w:pPr>
-            <w:r>
-              <w:rPr>
-                <w:rFonts w:ascii="Segoe UI" w:cs="Segoe UI" w:eastAsia="Segoe UI" w:hAnsi="Segoe UI"/>
-                <w:sz w:val="20"/>
-                <w:szCs w:val="20"/>
-              </w:rPr>
-              <w:t xml:space="preserve"/>
-            </w:r>
-          </w:p>
-        </w:tc>
-      </w:tr>
-      <w:tr>
-        <w:tc>
-          <w:tcPr>
-            <w:shd w:color="F5F4F2" w:val="solid"/>
-            <w:vAlign w:val="center"/>
-          </w:tcPr>
-          <w:p>
-            <w:r>
-              <w:rPr>
-                <w:rFonts w:ascii="Segoe UI" w:cs="Segoe UI" w:eastAsia="Segoe UI" w:hAnsi="Segoe UI"/>
-                <w:color w:val="2D2A26"/>
-                <w:sz w:val="20"/>
-                <w:szCs w:val="20"/>
-              </w:rPr>
-              <w:t xml:space="preserve">Output format</w:t>
-            </w:r>
-          </w:p>
-        </w:tc>
-        <w:tc>
-          <w:tcPr>
-            <w:shd w:color="F5F4F2" w:val="solid"/>
-            <w:vAlign w:val="center"/>
-          </w:tcPr>
-          <w:p>
-            <w:r>
-              <w:rPr>
-                <w:rFonts w:ascii="Segoe UI" w:cs="Segoe UI" w:eastAsia="Segoe UI" w:hAnsi="Segoe UI"/>
-                <w:color w:val="2D2A26"/>
-                <w:sz w:val="20"/>
-                <w:szCs w:val="20"/>
-              </w:rPr>
-              <w:t xml:space="preserve">Title + short content blob</w:t>
-            </w:r>
-          </w:p>
-        </w:tc>
-        <w:tc>
-          <w:tcPr>
-            <w:shd w:color="F5F4F2" w:val="solid"/>
-            <w:vAlign w:val="center"/>
-          </w:tcPr>
-          <w:p>
-            <w:r>
-              <w:rPr>
-                <w:rFonts w:ascii="Segoe UI" w:cs="Segoe UI" w:eastAsia="Segoe UI" w:hAnsi="Segoe UI"/>
-                <w:color w:val="2D2A26"/>
-                <w:sz w:val="20"/>
-                <w:szCs w:val="20"/>
-              </w:rPr>
-              <w:t xml:space="preserve">Title + structured markdown with headings, bold terms, numbered lists</w:t>
-            </w:r>
-          </w:p>
-        </w:tc>
-        <w:tc>
-          <w:tcPr>
-            <w:shd w:color="F5F4F2" w:val="solid"/>
-            <w:vAlign w:val="center"/>
-          </w:tcPr>
-          <w:p>
-            <w:pPr>
-              <w:jc w:val="center"/>
-            </w:pPr>
-            <w:r>
-              <w:rPr>
-                <w:rFonts w:ascii="Segoe UI" w:cs="Segoe UI" w:eastAsia="Segoe UI" w:hAnsi="Segoe UI"/>
-                <w:sz w:val="20"/>
-                <w:szCs w:val="20"/>
-              </w:rPr>
-              <w:t xml:space="preserve"/>
-            </w:r>
-          </w:p>
-        </w:tc>
-      </w:tr>
-      <w:tr>
-        <w:tc>
-          <w:tcPr>
-            <w:vAlign w:val="center"/>
-          </w:tcPr>
-          <w:p>
-            <w:r>
-              <w:rPr>
-                <w:rFonts w:ascii="Segoe UI" w:cs="Segoe UI" w:eastAsia="Segoe UI" w:hAnsi="Segoe UI"/>
-                <w:color w:val="2D2A26"/>
-                <w:sz w:val="20"/>
-                <w:szCs w:val="20"/>
-              </w:rPr>
-              <w:t xml:space="preserve">Educational depth</w:t>
-            </w:r>
-          </w:p>
-        </w:tc>
-        <w:tc>
-          <w:tcPr>
-            <w:vAlign w:val="center"/>
-          </w:tcPr>
-          <w:p>
-            <w:r>
-              <w:rPr>
-                <w:rFonts w:ascii="Segoe UI" w:cs="Segoe UI" w:eastAsia="Segoe UI" w:hAnsi="Segoe UI"/>
-                <w:color w:val="2D2A26"/>
-                <w:sz w:val="20"/>
-                <w:szCs w:val="20"/>
-              </w:rPr>
-              <w:t xml:space="preserve">Surface-level trivia</w:t>
-            </w:r>
-          </w:p>
-        </w:tc>
-        <w:tc>
-          <w:tcPr>
-            <w:vAlign w:val="center"/>
-          </w:tcPr>
-          <w:p>
-            <w:r>
-              <w:rPr>
-                <w:rFonts w:ascii="Segoe UI" w:cs="Segoe UI" w:eastAsia="Segoe UI" w:hAnsi="Segoe UI"/>
-                <w:color w:val="2D2A26"/>
-                <w:sz w:val="20"/>
-                <w:szCs w:val="20"/>
-              </w:rPr>
-              <w:t xml:space="preserve">Comprehensive lesson suitable for student learning</w:t>
-            </w:r>
-          </w:p>
-        </w:tc>
-        <w:tc>
-          <w:tcPr>
-            <w:vAlign w:val="center"/>
-          </w:tcPr>
-          <w:p>
-            <w:pPr>
-              <w:jc w:val="center"/>
-            </w:pPr>
-            <w:r>
-              <w:rPr>
-                <w:rFonts w:ascii="Segoe UI" w:cs="Segoe UI" w:eastAsia="Segoe UI" w:hAnsi="Segoe UI"/>
-                <w:sz w:val="20"/>
-                <w:szCs w:val="20"/>
-              </w:rPr>
-              <w:t xml:space="preserve"/>
-            </w:r>
-          </w:p>
-        </w:tc>
-      </w:tr>
-    </w:tbl>
-    <w:p>
-      <w:pPr>
-        <w:spacing w:after="100" w:before="100"/>
-      </w:pPr>
-    </w:p>
-    <w:p>
-      <w:pPr>
-        <w:pStyle w:val="Heading3"/>
-        <w:spacing w:after="100" w:before="300"/>
-      </w:pPr>
-      <w:r>
-        <w:rPr>
-          <w:rFonts w:ascii="Segoe UI" w:cs="Segoe UI" w:eastAsia="Segoe UI" w:hAnsi="Segoe UI"/>
-          <w:b/>
-          <w:bCs/>
-          <w:color w:val="2D2A26"/>
-        </w:rPr>
-        <w:t xml:space="preserve">Example Output: "AI &amp; Smart Assistants" (age 10)</w:t>
-      </w:r>
-    </w:p>
-    <w:p>
-      <w:pPr>
-        <w:spacing w:after="100"/>
-      </w:pPr>
-      <w:r>
-        <w:rPr>
-          <w:rFonts w:ascii="Segoe UI" w:cs="Segoe UI" w:eastAsia="Segoe UI" w:hAnsi="Segoe UI"/>
-          <w:color w:val="2D2A26"/>
-          <w:sz w:val="20"/>
-          <w:szCs w:val="20"/>
-        </w:rPr>
-        <w:t xml:space="preserve">Title: How AI and Smart Assistants Work</w:t>
-      </w:r>
-    </w:p>
-    <w:p>
-      <w:pPr>
-        <w:spacing w:after="100" w:before="100"/>
-      </w:pPr>
-    </w:p>
-    <w:p>
-      <w:pPr>
-        <w:spacing w:after="100"/>
-      </w:pPr>
-      <w:r>
-        <w:rPr>
-          <w:rFonts w:ascii="Segoe UI" w:cs="Segoe UI" w:eastAsia="Segoe UI" w:hAnsi="Segoe UI"/>
-          <w:color w:val="2D2A26"/>
-          <w:sz w:val="20"/>
-          <w:szCs w:val="20"/>
-        </w:rPr>
-        <w:t xml:space="preserve">## What is Artificial Intelligence?</w:t>
-      </w:r>
-    </w:p>
-    <w:p>
-      <w:pPr>
-        <w:spacing w:after="100"/>
-      </w:pPr>
-      <w:r>
-        <w:rPr>
-          <w:rFonts w:ascii="Segoe UI" w:cs="Segoe UI" w:eastAsia="Segoe UI" w:hAnsi="Segoe UI"/>
-          <w:color w:val="2D2A26"/>
-          <w:sz w:val="20"/>
-          <w:szCs w:val="20"/>
-        </w:rPr>
-        <w:t xml:space="preserve">AI means teaching computers to think and learn, similar to how your brain works. When you show a computer thousands of pictures of cats, it learns to recognise cats on its own...</w:t>
-      </w:r>
-    </w:p>
-    <w:p>
-      <w:pPr>
-        <w:spacing w:after="100" w:before="100"/>
-      </w:pPr>
-    </w:p>
-    <w:p>
-      <w:pPr>
-        <w:spacing w:after="100"/>
-      </w:pPr>
-      <w:r>
-        <w:rPr>
-          <w:rFonts w:ascii="Segoe UI" w:cs="Segoe UI" w:eastAsia="Segoe UI" w:hAnsi="Segoe UI"/>
-          <w:color w:val="2D2A26"/>
-          <w:sz w:val="20"/>
-          <w:szCs w:val="20"/>
-        </w:rPr>
-        <w:t xml:space="preserve">## Key Concepts</w:t>
-      </w:r>
-    </w:p>
-    <w:p>
-      <w:pPr>
-        <w:pStyle w:val="ListParagraph"/>
-        <w:numPr>
-          <w:ilvl w:val="0"/>
-          <w:numId w:val="1"/>
-        </w:numPr>
-        <w:spacing w:after="60"/>
-      </w:pPr>
-      <w:r>
-        <w:rPr>
-          <w:rFonts w:ascii="Segoe UI" w:cs="Segoe UI" w:eastAsia="Segoe UI" w:hAnsi="Segoe UI"/>
-          <w:color w:val="2D2A26"/>
-          <w:sz w:val="20"/>
-          <w:szCs w:val="20"/>
-        </w:rPr>
-        <w:t xml:space="preserve">Machine Learning — Computers learn from examples, like how you learn from practice. The more data they see, the smarter they get.</w:t>
-      </w:r>
-    </w:p>
-    <w:p>
-      <w:pPr>
-        <w:pStyle w:val="ListParagraph"/>
-        <w:numPr>
-          <w:ilvl w:val="0"/>
-          <w:numId w:val="1"/>
-        </w:numPr>
-        <w:spacing w:after="60"/>
-      </w:pPr>
-      <w:r>
-        <w:rPr>
-          <w:rFonts w:ascii="Segoe UI" w:cs="Segoe UI" w:eastAsia="Segoe UI" w:hAnsi="Segoe UI"/>
-          <w:color w:val="2D2A26"/>
-          <w:sz w:val="20"/>
-          <w:szCs w:val="20"/>
-        </w:rPr>
-        <w:t xml:space="preserve">Voice Assistants — Siri, Alexa, and Google understand your voice by converting sound waves into text, then figuring out what you mean.</w:t>
-      </w:r>
-    </w:p>
-    <w:p>
-      <w:pPr>
-        <w:pStyle w:val="ListParagraph"/>
-        <w:numPr>
-          <w:ilvl w:val="0"/>
-          <w:numId w:val="1"/>
-        </w:numPr>
-        <w:spacing w:after="60"/>
-      </w:pPr>
-      <w:r>
-        <w:rPr>
-          <w:rFonts w:ascii="Segoe UI" w:cs="Segoe UI" w:eastAsia="Segoe UI" w:hAnsi="Segoe UI"/>
-          <w:color w:val="2D2A26"/>
-          <w:sz w:val="20"/>
-          <w:szCs w:val="20"/>
-        </w:rPr>
-        <w:t xml:space="preserve">Neural Networks — Inspired by the human brain, these are layers of connected nodes that process information step by step.</w:t>
-      </w:r>
-    </w:p>
-    <w:p>
-      <w:pPr>
-        <w:pStyle w:val="ListParagraph"/>
-        <w:numPr>
-          <w:ilvl w:val="0"/>
-          <w:numId w:val="1"/>
-        </w:numPr>
-        <w:spacing w:after="60"/>
-      </w:pPr>
-      <w:r>
-        <w:rPr>
-          <w:rFonts w:ascii="Segoe UI" w:cs="Segoe UI" w:eastAsia="Segoe UI" w:hAnsi="Segoe UI"/>
-          <w:color w:val="2D2A26"/>
-          <w:sz w:val="20"/>
-          <w:szCs w:val="20"/>
-        </w:rPr>
-        <w:t xml:space="preserve">Training Data — AI needs lots of examples to learn. A self-driving car might study millions of hours of road footage.</w:t>
-      </w:r>
-    </w:p>
-    <w:p>
-      <w:pPr>
-        <w:spacing w:after="100" w:before="100"/>
-      </w:pPr>
-    </w:p>
-    <w:p>
-      <w:pPr>
-        <w:spacing w:after="100"/>
-      </w:pPr>
-      <w:r>
-        <w:rPr>
-          <w:rFonts w:ascii="Segoe UI" w:cs="Segoe UI" w:eastAsia="Segoe UI" w:hAnsi="Segoe UI"/>
-          <w:color w:val="2D2A26"/>
-          <w:sz w:val="20"/>
-          <w:szCs w:val="20"/>
-        </w:rPr>
-        <w:t xml:space="preserve">## Fun Facts</w:t>
-      </w:r>
-    </w:p>
-    <w:p>
-      <w:pPr>
-        <w:pStyle w:val="ListParagraph"/>
-        <w:numPr>
-          <w:ilvl w:val="0"/>
-          <w:numId w:val="1"/>
-        </w:numPr>
-        <w:spacing w:after="60"/>
-      </w:pPr>
-      <w:r>
-        <w:rPr>
-          <w:rFonts w:ascii="Segoe UI" w:cs="Segoe UI" w:eastAsia="Segoe UI" w:hAnsi="Segoe UI"/>
-          <w:color w:val="2D2A26"/>
-          <w:sz w:val="20"/>
-          <w:szCs w:val="20"/>
-        </w:rPr>
-        <w:t xml:space="preserve">The first AI program was written in 1951 by Christopher Strachey to play draughts.</w:t>
-      </w:r>
-    </w:p>
-    <w:p>
-      <w:pPr>
-        <w:pStyle w:val="ListParagraph"/>
-        <w:numPr>
-          <w:ilvl w:val="0"/>
-          <w:numId w:val="1"/>
-        </w:numPr>
-        <w:spacing w:after="60"/>
-      </w:pPr>
-      <w:r>
-        <w:rPr>
-          <w:rFonts w:ascii="Segoe UI" w:cs="Segoe UI" w:eastAsia="Segoe UI" w:hAnsi="Segoe UI"/>
-          <w:color w:val="2D2A26"/>
-          <w:sz w:val="20"/>
-          <w:szCs w:val="20"/>
-        </w:rPr>
-        <w:t xml:space="preserve">Smart assistants process your voice in less than 1 second, even though the audio travels to a server and back.</w:t>
-      </w:r>
-    </w:p>
-    <w:p>
-      <w:pPr>
-        <w:pStyle w:val="ListParagraph"/>
-        <w:numPr>
-          <w:ilvl w:val="0"/>
-          <w:numId w:val="1"/>
-        </w:numPr>
-        <w:spacing w:after="60"/>
-      </w:pPr>
-      <w:r>
-        <w:rPr>
-          <w:rFonts w:ascii="Segoe UI" w:cs="Segoe UI" w:eastAsia="Segoe UI" w:hAnsi="Segoe UI"/>
-          <w:color w:val="2D2A26"/>
-          <w:sz w:val="20"/>
-          <w:szCs w:val="20"/>
-        </w:rPr>
-        <w:t xml:space="preserve">AI can now write poetry, compose music, and even create art — but it still cannot truly "understand" emotions.</w:t>
-      </w:r>
-    </w:p>
-    <w:p>
-      <w:pPr>
-        <w:spacing w:after="100" w:before="100"/>
-      </w:pPr>
-    </w:p>
-    <w:p>
-      <w:pPr>
-        <w:spacing w:after="100"/>
-      </w:pPr>
-      <w:r>
-        <w:rPr>
-          <w:rFonts w:ascii="Segoe UI" w:cs="Segoe UI" w:eastAsia="Segoe UI" w:hAnsi="Segoe UI"/>
-          <w:color w:val="2D2A26"/>
-          <w:sz w:val="20"/>
-          <w:szCs w:val="20"/>
-        </w:rPr>
-        <w:t xml:space="preserve">## Try This!</w:t>
-      </w:r>
-    </w:p>
-    <w:p>
-      <w:pPr>
-        <w:pStyle w:val="ListParagraph"/>
-        <w:numPr>
-          <w:ilvl w:val="0"/>
-          <w:numId w:val="1"/>
-        </w:numPr>
-        <w:spacing w:after="60"/>
-      </w:pPr>
-      <w:r>
-        <w:rPr>
-          <w:rFonts w:ascii="Segoe UI" w:cs="Segoe UI" w:eastAsia="Segoe UI" w:hAnsi="Segoe UI"/>
-          <w:color w:val="2D2A26"/>
-          <w:sz w:val="20"/>
-          <w:szCs w:val="20"/>
-        </w:rPr>
-        <w:t xml:space="preserve">Ask a voice assistant "How do you work?" and see what it says.</w:t>
-      </w:r>
-    </w:p>
-    <w:p>
-      <w:pPr>
-        <w:pStyle w:val="ListParagraph"/>
-        <w:numPr>
-          <w:ilvl w:val="0"/>
-          <w:numId w:val="1"/>
-        </w:numPr>
-        <w:spacing w:after="60"/>
-      </w:pPr>
-      <w:r>
-        <w:rPr>
-          <w:rFonts w:ascii="Segoe UI" w:cs="Segoe UI" w:eastAsia="Segoe UI" w:hAnsi="Segoe UI"/>
-          <w:color w:val="2D2A26"/>
-          <w:sz w:val="20"/>
-          <w:szCs w:val="20"/>
-        </w:rPr>
-        <w:t xml:space="preserve">Try giving the same question to two different assistants and compare their answers.</w:t>
-      </w:r>
-    </w:p>
-    <w:p>
-      <w:pPr>
-        <w:pStyle w:val="ListParagraph"/>
-        <w:numPr>
-          <w:ilvl w:val="0"/>
-          <w:numId w:val="1"/>
-        </w:numPr>
-        <w:spacing w:after="60"/>
-      </w:pPr>
-      <w:r>
-        <w:rPr>
-          <w:rFonts w:ascii="Segoe UI" w:cs="Segoe UI" w:eastAsia="Segoe UI" w:hAnsi="Segoe UI"/>
-          <w:color w:val="2D2A26"/>
-          <w:sz w:val="20"/>
-          <w:szCs w:val="20"/>
-        </w:rPr>
-        <w:t xml:space="preserve">Draw a picture of what you think a robot brain looks like inside.</w:t>
-      </w:r>
-    </w:p>
-    <w:p>
-      <w:pPr>
-        <w:spacing w:after="100" w:before="100"/>
-      </w:pPr>
-    </w:p>
-    <w:p>
-      <w:pPr>
-        <w:pStyle w:val="Heading3"/>
-        <w:spacing w:after="100" w:before="300"/>
-      </w:pPr>
-      <w:r>
-        <w:rPr>
-          <w:rFonts w:ascii="Segoe UI" w:cs="Segoe UI" w:eastAsia="Segoe UI" w:hAnsi="Segoe UI"/>
-          <w:b/>
-          <w:bCs/>
-          <w:color w:val="2D2A26"/>
-        </w:rPr>
-        <w:t xml:space="preserve">Implementation Changes</w:t>
-      </w:r>
-    </w:p>
-    <w:p>
-      <w:pPr>
-        <w:pStyle w:val="ListParagraph"/>
-        <w:numPr>
-          <w:ilvl w:val="0"/>
-          <w:numId w:val="1"/>
-        </w:numPr>
-        <w:spacing w:after="60"/>
-      </w:pPr>
-      <w:r>
-        <w:rPr>
-          <w:rFonts w:ascii="Segoe UI" w:cs="Segoe UI" w:eastAsia="Segoe UI" w:hAnsi="Segoe UI"/>
-          <w:color w:val="2D2A26"/>
-          <w:sz w:val="20"/>
-          <w:szCs w:val="20"/>
-        </w:rPr>
-        <w:t xml:space="preserve">Update system prompt in server/src/routes/topics.ts to request structured mini-lesson format</w:t>
-      </w:r>
-    </w:p>
-    <w:p>
-      <w:pPr>
-        <w:pStyle w:val="ListParagraph"/>
-        <w:numPr>
-          <w:ilvl w:val="0"/>
-          <w:numId w:val="1"/>
-        </w:numPr>
-        <w:spacing w:after="60"/>
-      </w:pPr>
-      <w:r>
-        <w:rPr>
-          <w:rFonts w:ascii="Segoe UI" w:cs="Segoe UI" w:eastAsia="Segoe UI" w:hAnsi="Segoe UI"/>
-          <w:color w:val="2D2A26"/>
-          <w:sz w:val="20"/>
-          <w:szCs w:val="20"/>
-        </w:rPr>
-        <w:t xml:space="preserve">Increase max_tokens from 500 to 2000</w:t>
-      </w:r>
-    </w:p>
-    <w:p>
-      <w:pPr>
-        <w:pStyle w:val="ListParagraph"/>
-        <w:numPr>
-          <w:ilvl w:val="0"/>
-          <w:numId w:val="1"/>
-        </w:numPr>
-        <w:spacing w:after="60"/>
-      </w:pPr>
-      <w:r>
-        <w:rPr>
-          <w:rFonts w:ascii="Segoe UI" w:cs="Segoe UI" w:eastAsia="Segoe UI" w:hAnsi="Segoe UI"/>
-          <w:color w:val="2D2A26"/>
-          <w:sz w:val="20"/>
-          <w:szCs w:val="20"/>
-        </w:rPr>
-        <w:t xml:space="preserve">Extend age validation from max 12 to max 14</w:t>
-      </w:r>
-    </w:p>
-    <w:p>
-      <w:pPr>
-        <w:pStyle w:val="ListParagraph"/>
-        <w:numPr>
-          <w:ilvl w:val="0"/>
-          <w:numId w:val="1"/>
-        </w:numPr>
-        <w:spacing w:after="60"/>
-      </w:pPr>
-      <w:r>
-        <w:rPr>
-          <w:rFonts w:ascii="Segoe UI" w:cs="Segoe UI" w:eastAsia="Segoe UI" w:hAnsi="Segoe UI"/>
-          <w:color w:val="2D2A26"/>
-          <w:sz w:val="20"/>
-          <w:szCs w:val="20"/>
-        </w:rPr>
-        <w:t xml:space="preserve">Upgrade model from gemini-2.0-flash-001 to gemini-2.5-flash</w:t>
-      </w:r>
-    </w:p>
-    <w:p>
-      <w:pPr>
-        <w:pStyle w:val="ListParagraph"/>
-        <w:numPr>
-          <w:ilvl w:val="0"/>
-          <w:numId w:val="1"/>
-        </w:numPr>
-        <w:spacing w:after="60"/>
-      </w:pPr>
-      <w:r>
-        <w:rPr>
-          <w:rFonts w:ascii="Segoe UI" w:cs="Segoe UI" w:eastAsia="Segoe UI" w:hAnsi="Segoe UI"/>
-          <w:color w:val="2D2A26"/>
-          <w:sz w:val="20"/>
-          <w:szCs w:val="20"/>
-        </w:rPr>
-        <w:t xml:space="preserve">Add markdown rendering support in the frontend topic post display</w:t>
-      </w:r>
-    </w:p>
     <w:p>
       <w:pPr>
         <w:spacing w:after="100" w:before="100"/>
@@ -4189,7 +3136,7 @@
                 <w:sz w:val="20"/>
                 <w:szCs w:val="20"/>
               </w:rPr>
-              <w:t xml:space="preserve">6 tasks (2 done)</w:t>
+              <w:t xml:space="preserve">6 tasks (3 done)</w:t>
             </w:r>
           </w:p>
         </w:tc>
@@ -4535,7 +3482,7 @@
                 <w:sz w:val="20"/>
                 <w:szCs w:val="20"/>
               </w:rPr>
-              <w:t xml:space="preserve">3 tasks</w:t>
+              <w:t xml:space="preserve">3 tasks (3 done)</w:t>
             </w:r>
           </w:p>
         </w:tc>
@@ -4709,7 +3656,7 @@
           <w:sz w:val="22"/>
           <w:szCs w:val="22"/>
         </w:rPr>
-        <w:t xml:space="preserve">5 completed</w:t>
+        <w:t xml:space="preserve">9 completed</w:t>
       </w:r>
       <w:r>
         <w:rPr>
@@ -4720,7 +3667,7 @@
           <w:sz w:val="22"/>
           <w:szCs w:val="22"/>
         </w:rPr>
-        <w:t xml:space="preserve">, 18 remaining</w:t>
+        <w:t xml:space="preserve">, 14 remaining</w:t>
       </w:r>
     </w:p>
     <w:sectPr>
@@ -4895,15 +3842,6 @@
       <w:pPr>
         <w:ind w:left="6480" w:hanging="360"/>
       </w:pPr>
-    </w:lvl>
-  </w:abstractNum>
-  <w:abstractNum w:abstractNumId="2" w15:restartNumberingAfterBreak="0">
-    <w:multiLevelType w:val="hybridMultilevel"/>
-    <w:lvl w:ilvl="0" w15:tentative="1">
-      <w:start w:val="1"/>
-      <w:numFmt w:val="bullet"/>
-      <w:lvlText w:val="•"/>
-      <w:lvlJc w:val="left"/>
     </w:lvl>
   </w:abstractNum>
   <w:num w:numId="1">

</xml_diff>

<commit_message>
Update roadmap: mark tasks 11, 12, 16 as done
Phase 1 now fully complete (6/6). Total: 12 completed, 11 remaining.
</commit_message>
<xml_diff>
--- a/docs/Yoluno_Development_Roadmap.docx
+++ b/docs/Yoluno_Development_Roadmap.docx
@@ -380,6 +380,7 @@
         <w:tc>
           <w:tcPr>
             <w:vAlign w:val="center"/>
+            <w:shd w:val="solid" w:color="D4EDDA" w:fill="auto"/>
           </w:tcPr>
           <w:p>
             <w:r>
@@ -396,6 +397,7 @@
         <w:tc>
           <w:tcPr>
             <w:vAlign w:val="center"/>
+            <w:shd w:val="solid" w:color="D4EDDA" w:fill="auto"/>
           </w:tcPr>
           <w:p>
             <w:r>
@@ -412,6 +414,7 @@
         <w:tc>
           <w:tcPr>
             <w:vAlign w:val="center"/>
+            <w:shd w:val="solid" w:color="D4EDDA" w:fill="auto"/>
           </w:tcPr>
           <w:p>
             <w:r>
@@ -428,6 +431,7 @@
         <w:tc>
           <w:tcPr>
             <w:vAlign w:val="center"/>
+            <w:shd w:val="solid" w:color="D4EDDA" w:fill="auto"/>
           </w:tcPr>
           <w:p>
             <w:r>
@@ -444,6 +448,7 @@
         <w:tc>
           <w:tcPr>
             <w:vAlign w:val="center"/>
+            <w:shd w:val="solid" w:color="D4EDDA" w:fill="auto"/>
           </w:tcPr>
           <w:p>
             <w:pPr>
@@ -455,7 +460,7 @@
                 <w:sz w:val="20"/>
                 <w:szCs w:val="20"/>
               </w:rPr>
-              <w:t xml:space="preserve"/>
+              <w:t>✅</w:t>
             </w:r>
           </w:p>
         </w:tc>
@@ -463,8 +468,8 @@
       <w:tr>
         <w:tc>
           <w:tcPr>
-            <w:shd w:color="F5F4F2" w:val="solid"/>
-            <w:vAlign w:val="center"/>
+            <w:vAlign w:val="center"/>
+            <w:shd w:val="solid" w:color="D4EDDA" w:fill="auto"/>
           </w:tcPr>
           <w:p>
             <w:r>
@@ -480,8 +485,8 @@
         </w:tc>
         <w:tc>
           <w:tcPr>
-            <w:shd w:color="F5F4F2" w:val="solid"/>
-            <w:vAlign w:val="center"/>
+            <w:vAlign w:val="center"/>
+            <w:shd w:val="solid" w:color="D4EDDA" w:fill="auto"/>
           </w:tcPr>
           <w:p>
             <w:r>
@@ -497,8 +502,8 @@
         </w:tc>
         <w:tc>
           <w:tcPr>
-            <w:shd w:color="F5F4F2" w:val="solid"/>
-            <w:vAlign w:val="center"/>
+            <w:vAlign w:val="center"/>
+            <w:shd w:val="solid" w:color="D4EDDA" w:fill="auto"/>
           </w:tcPr>
           <w:p>
             <w:r>
@@ -514,8 +519,8 @@
         </w:tc>
         <w:tc>
           <w:tcPr>
-            <w:shd w:color="F5F4F2" w:val="solid"/>
-            <w:vAlign w:val="center"/>
+            <w:vAlign w:val="center"/>
+            <w:shd w:val="solid" w:color="D4EDDA" w:fill="auto"/>
           </w:tcPr>
           <w:p>
             <w:r>
@@ -531,8 +536,8 @@
         </w:tc>
         <w:tc>
           <w:tcPr>
-            <w:shd w:color="F5F4F2" w:val="solid"/>
-            <w:vAlign w:val="center"/>
+            <w:vAlign w:val="center"/>
+            <w:shd w:val="solid" w:color="D4EDDA" w:fill="auto"/>
           </w:tcPr>
           <w:p>
             <w:pPr>
@@ -544,7 +549,7 @@
                 <w:sz w:val="20"/>
                 <w:szCs w:val="20"/>
               </w:rPr>
-              <w:t xml:space="preserve"/>
+              <w:t>✅</w:t>
             </w:r>
           </w:p>
         </w:tc>
@@ -553,6 +558,7 @@
         <w:tc>
           <w:tcPr>
             <w:vAlign w:val="center"/>
+            <w:shd w:val="solid" w:color="D4EDDA" w:fill="auto"/>
           </w:tcPr>
           <w:p>
             <w:r>
@@ -569,6 +575,7 @@
         <w:tc>
           <w:tcPr>
             <w:vAlign w:val="center"/>
+            <w:shd w:val="solid" w:color="D4EDDA" w:fill="auto"/>
           </w:tcPr>
           <w:p>
             <w:r>
@@ -585,6 +592,7 @@
         <w:tc>
           <w:tcPr>
             <w:vAlign w:val="center"/>
+            <w:shd w:val="solid" w:color="D4EDDA" w:fill="auto"/>
           </w:tcPr>
           <w:p>
             <w:r>
@@ -601,6 +609,7 @@
         <w:tc>
           <w:tcPr>
             <w:vAlign w:val="center"/>
+            <w:shd w:val="solid" w:color="D4EDDA" w:fill="auto"/>
           </w:tcPr>
           <w:p>
             <w:r>
@@ -617,6 +626,7 @@
         <w:tc>
           <w:tcPr>
             <w:vAlign w:val="center"/>
+            <w:shd w:val="solid" w:color="D4EDDA" w:fill="auto"/>
           </w:tcPr>
           <w:p>
             <w:pPr>
@@ -628,7 +638,7 @@
                 <w:sz w:val="20"/>
                 <w:szCs w:val="20"/>
               </w:rPr>
-              <w:t xml:space="preserve"/>
+              <w:t>✅</w:t>
             </w:r>
           </w:p>
         </w:tc>
@@ -3136,7 +3146,7 @@
                 <w:sz w:val="20"/>
                 <w:szCs w:val="20"/>
               </w:rPr>
-              <w:t xml:space="preserve">6 tasks (3 done)</w:t>
+              <w:t>6 tasks (6 done)</w:t>
             </w:r>
           </w:p>
         </w:tc>
@@ -3656,7 +3666,7 @@
           <w:sz w:val="22"/>
           <w:szCs w:val="22"/>
         </w:rPr>
-        <w:t xml:space="preserve">9 completed</w:t>
+        <w:t>9 completed</w:t>
       </w:r>
       <w:r>
         <w:rPr>

</xml_diff>

<commit_message>
Implement story loading screen and kid notifications system
Task 13: Story loading screen with rotating fun messages, estimated
wait time, and suggestions to chat with Luno or go on a journey
while illustrations are being created.

Task 14: Kid notifications system with story completion alerts.
- New kid_notifications table (migration 040)
- Backend routes for kid notification CRUD
- Story generation sends notification when all illustrations complete
- Real-time socket delivery to kids mode
- Notification bell added to kids home header
- New tasks 24 & 25 added to roadmap
</commit_message>
<xml_diff>
--- a/docs/Yoluno_Development_Roadmap.docx
+++ b/docs/Yoluno_Development_Roadmap.docx
@@ -2980,6 +2980,174 @@
           </w:p>
         </w:tc>
       </w:tr>
+      <w:tr>
+        <w:tc>
+          <w:tcPr>
+            <w:vAlign w:val="center"/>
+          </w:tcPr>
+          <w:p>
+            <w:r>
+              <w:rPr>
+                <w:rFonts w:ascii="Segoe UI" w:cs="Segoe UI" w:eastAsia="Segoe UI" w:hAnsi="Segoe UI"/>
+                <w:color w:val="2D2A26"/>
+                <w:sz w:val="20"/>
+                <w:szCs w:val="20"/>
+              </w:rPr>
+              <w:t xml:space="preserve">24</w:t>
+            </w:r>
+          </w:p>
+        </w:tc>
+        <w:tc>
+          <w:tcPr>
+            <w:vAlign w:val="center"/>
+          </w:tcPr>
+          <w:p>
+            <w:r>
+              <w:rPr>
+                <w:rFonts w:ascii="Segoe UI" w:cs="Segoe UI" w:eastAsia="Segoe UI" w:hAnsi="Segoe UI"/>
+                <w:color w:val="2D2A26"/>
+                <w:sz w:val="20"/>
+                <w:szCs w:val="20"/>
+              </w:rPr>
+              <w:t xml:space="preserve">Rename Lala to Lottie</w:t>
+            </w:r>
+          </w:p>
+        </w:tc>
+        <w:tc>
+          <w:tcPr>
+            <w:vAlign w:val="center"/>
+          </w:tcPr>
+          <w:p>
+            <w:r>
+              <w:rPr>
+                <w:rFonts w:ascii="Segoe UI" w:cs="Segoe UI" w:eastAsia="Segoe UI" w:hAnsi="Segoe UI"/>
+                <w:color w:val="2D2A26"/>
+                <w:sz w:val="20"/>
+                <w:szCs w:val="20"/>
+              </w:rPr>
+              <w:t xml:space="preserve">Change character name from Lala to Lottie across the entire platform</w:t>
+            </w:r>
+          </w:p>
+        </w:tc>
+        <w:tc>
+          <w:tcPr>
+            <w:vAlign w:val="center"/>
+          </w:tcPr>
+          <w:p>
+            <w:r>
+              <w:rPr>
+                <w:rFonts w:ascii="Segoe UI" w:cs="Segoe UI" w:eastAsia="Segoe UI" w:hAnsi="Segoe UI"/>
+                <w:color w:val="2D2A26"/>
+                <w:sz w:val="20"/>
+                <w:szCs w:val="20"/>
+              </w:rPr>
+              <w:t xml:space="preserve">1 hr</w:t>
+            </w:r>
+          </w:p>
+        </w:tc>
+        <w:tc>
+          <w:tcPr>
+            <w:vAlign w:val="center"/>
+          </w:tcPr>
+          <w:p>
+            <w:pPr>
+              <w:jc w:val="center"/>
+            </w:pPr>
+            <w:r>
+              <w:rPr>
+                <w:rFonts w:ascii="Segoe UI" w:cs="Segoe UI" w:eastAsia="Segoe UI" w:hAnsi="Segoe UI"/>
+                <w:sz w:val="20"/>
+                <w:szCs w:val="20"/>
+              </w:rPr>
+              <w:t xml:space="preserve"/>
+            </w:r>
+          </w:p>
+        </w:tc>
+      </w:tr>
+      <w:tr>
+        <w:tc>
+          <w:tcPr>
+            <w:vAlign w:val="center"/>
+          </w:tcPr>
+          <w:p>
+            <w:r>
+              <w:rPr>
+                <w:rFonts w:ascii="Segoe UI" w:cs="Segoe UI" w:eastAsia="Segoe UI" w:hAnsi="Segoe UI"/>
+                <w:color w:val="2D2A26"/>
+                <w:sz w:val="20"/>
+                <w:szCs w:val="20"/>
+              </w:rPr>
+              <w:t xml:space="preserve">25</w:t>
+            </w:r>
+          </w:p>
+        </w:tc>
+        <w:tc>
+          <w:tcPr>
+            <w:vAlign w:val="center"/>
+          </w:tcPr>
+          <w:p>
+            <w:r>
+              <w:rPr>
+                <w:rFonts w:ascii="Segoe UI" w:cs="Segoe UI" w:eastAsia="Segoe UI" w:hAnsi="Segoe UI"/>
+                <w:color w:val="2D2A26"/>
+                <w:sz w:val="20"/>
+                <w:szCs w:val="20"/>
+              </w:rPr>
+              <w:t xml:space="preserve">Kids Dashboard Colors</w:t>
+            </w:r>
+          </w:p>
+        </w:tc>
+        <w:tc>
+          <w:tcPr>
+            <w:vAlign w:val="center"/>
+          </w:tcPr>
+          <w:p>
+            <w:r>
+              <w:rPr>
+                <w:rFonts w:ascii="Segoe UI" w:cs="Segoe UI" w:eastAsia="Segoe UI" w:hAnsi="Segoe UI"/>
+                <w:color w:val="2D2A26"/>
+                <w:sz w:val="20"/>
+                <w:szCs w:val="20"/>
+              </w:rPr>
+              <w:t xml:space="preserve">Update kids mode backgrounds: blue for chat (Luno), red for journeys (Lolo), yellow for family (Lottie). Update parent family tree to yellow.</w:t>
+            </w:r>
+          </w:p>
+        </w:tc>
+        <w:tc>
+          <w:tcPr>
+            <w:vAlign w:val="center"/>
+          </w:tcPr>
+          <w:p>
+            <w:r>
+              <w:rPr>
+                <w:rFonts w:ascii="Segoe UI" w:cs="Segoe UI" w:eastAsia="Segoe UI" w:hAnsi="Segoe UI"/>
+                <w:color w:val="2D2A26"/>
+                <w:sz w:val="20"/>
+                <w:szCs w:val="20"/>
+              </w:rPr>
+              <w:t xml:space="preserve">1-2 hr</w:t>
+            </w:r>
+          </w:p>
+        </w:tc>
+        <w:tc>
+          <w:tcPr>
+            <w:vAlign w:val="center"/>
+          </w:tcPr>
+          <w:p>
+            <w:pPr>
+              <w:jc w:val="center"/>
+            </w:pPr>
+            <w:r>
+              <w:rPr>
+                <w:rFonts w:ascii="Segoe UI" w:cs="Segoe UI" w:eastAsia="Segoe UI" w:hAnsi="Segoe UI"/>
+                <w:sz w:val="20"/>
+                <w:szCs w:val="20"/>
+              </w:rPr>
+              <w:t xml:space="preserve"/>
+            </w:r>
+          </w:p>
+        </w:tc>
+      </w:tr>
     </w:tbl>
     <w:p>
       <w:pPr>
@@ -3578,7 +3746,7 @@
                 <w:sz w:val="20"/>
                 <w:szCs w:val="20"/>
               </w:rPr>
-              <w:t xml:space="preserve">4 tasks</w:t>
+              <w:t>6 tasks</w:t>
             </w:r>
           </w:p>
         </w:tc>

</xml_diff>

<commit_message>
Add better avatars and rename Lala to Lottie
Task 6: Replace 18 old DiceBear avatars with 20 new ones across
4 categories: Adventurers, Micah, Portraits, Animals.

Task 24: Rename character Lala to Lottie across the entire platform.
Updated all frontend components, landing pages, AI prompts in
buddyChat, avatar files, and voice character mapping. CSS color
variable 'lala' kept unchanged.
</commit_message>
<xml_diff>
--- a/docs/Yoluno_Development_Roadmap.docx
+++ b/docs/Yoluno_Development_Roadmap.docx
@@ -1309,6 +1309,7 @@
         <w:tc>
           <w:tcPr>
             <w:vAlign w:val="center"/>
+            <w:shd w:val="solid" w:color="D4EDDA" w:fill="auto"/>
           </w:tcPr>
           <w:p>
             <w:r>
@@ -1325,6 +1326,7 @@
         <w:tc>
           <w:tcPr>
             <w:vAlign w:val="center"/>
+            <w:shd w:val="solid" w:color="D4EDDA" w:fill="auto"/>
           </w:tcPr>
           <w:p>
             <w:r>
@@ -1341,6 +1343,7 @@
         <w:tc>
           <w:tcPr>
             <w:vAlign w:val="center"/>
+            <w:shd w:val="solid" w:color="D4EDDA" w:fill="auto"/>
           </w:tcPr>
           <w:p>
             <w:r>
@@ -1357,6 +1360,7 @@
         <w:tc>
           <w:tcPr>
             <w:vAlign w:val="center"/>
+            <w:shd w:val="solid" w:color="D4EDDA" w:fill="auto"/>
           </w:tcPr>
           <w:p>
             <w:r>
@@ -1373,6 +1377,7 @@
         <w:tc>
           <w:tcPr>
             <w:vAlign w:val="center"/>
+            <w:shd w:val="solid" w:color="D4EDDA" w:fill="auto"/>
           </w:tcPr>
           <w:p>
             <w:pPr>
@@ -1384,7 +1389,7 @@
                 <w:sz w:val="20"/>
                 <w:szCs w:val="20"/>
               </w:rPr>
-              <w:t xml:space="preserve"/>
+              <w:t>✅</w:t>
             </w:r>
           </w:p>
         </w:tc>
@@ -1392,8 +1397,8 @@
       <w:tr>
         <w:tc>
           <w:tcPr>
-            <w:shd w:color="F5F4F2" w:val="solid"/>
-            <w:vAlign w:val="center"/>
+            <w:vAlign w:val="center"/>
+            <w:shd w:val="solid" w:color="D4EDDA" w:fill="auto"/>
           </w:tcPr>
           <w:p>
             <w:r>
@@ -1409,8 +1414,8 @@
         </w:tc>
         <w:tc>
           <w:tcPr>
-            <w:shd w:color="F5F4F2" w:val="solid"/>
-            <w:vAlign w:val="center"/>
+            <w:vAlign w:val="center"/>
+            <w:shd w:val="solid" w:color="D4EDDA" w:fill="auto"/>
           </w:tcPr>
           <w:p>
             <w:r>
@@ -1426,8 +1431,8 @@
         </w:tc>
         <w:tc>
           <w:tcPr>
-            <w:shd w:color="F5F4F2" w:val="solid"/>
-            <w:vAlign w:val="center"/>
+            <w:vAlign w:val="center"/>
+            <w:shd w:val="solid" w:color="D4EDDA" w:fill="auto"/>
           </w:tcPr>
           <w:p>
             <w:r>
@@ -1443,8 +1448,8 @@
         </w:tc>
         <w:tc>
           <w:tcPr>
-            <w:shd w:color="F5F4F2" w:val="solid"/>
-            <w:vAlign w:val="center"/>
+            <w:vAlign w:val="center"/>
+            <w:shd w:val="solid" w:color="D4EDDA" w:fill="auto"/>
           </w:tcPr>
           <w:p>
             <w:r>
@@ -1460,8 +1465,8 @@
         </w:tc>
         <w:tc>
           <w:tcPr>
-            <w:shd w:color="F5F4F2" w:val="solid"/>
-            <w:vAlign w:val="center"/>
+            <w:vAlign w:val="center"/>
+            <w:shd w:val="solid" w:color="D4EDDA" w:fill="auto"/>
           </w:tcPr>
           <w:p>
             <w:pPr>
@@ -1473,7 +1478,7 @@
                 <w:sz w:val="20"/>
                 <w:szCs w:val="20"/>
               </w:rPr>
-              <w:t xml:space="preserve"/>
+              <w:t>✅</w:t>
             </w:r>
           </w:p>
         </w:tc>
@@ -1482,6 +1487,7 @@
         <w:tc>
           <w:tcPr>
             <w:vAlign w:val="center"/>
+            <w:shd w:val="solid" w:color="D4EDDA" w:fill="auto"/>
           </w:tcPr>
           <w:p>
             <w:r>
@@ -1498,6 +1504,7 @@
         <w:tc>
           <w:tcPr>
             <w:vAlign w:val="center"/>
+            <w:shd w:val="solid" w:color="D4EDDA" w:fill="auto"/>
           </w:tcPr>
           <w:p>
             <w:r>
@@ -1514,6 +1521,7 @@
         <w:tc>
           <w:tcPr>
             <w:vAlign w:val="center"/>
+            <w:shd w:val="solid" w:color="D4EDDA" w:fill="auto"/>
           </w:tcPr>
           <w:p>
             <w:r>
@@ -1530,6 +1538,7 @@
         <w:tc>
           <w:tcPr>
             <w:vAlign w:val="center"/>
+            <w:shd w:val="solid" w:color="D4EDDA" w:fill="auto"/>
           </w:tcPr>
           <w:p>
             <w:r>
@@ -1546,6 +1555,7 @@
         <w:tc>
           <w:tcPr>
             <w:vAlign w:val="center"/>
+            <w:shd w:val="solid" w:color="D4EDDA" w:fill="auto"/>
           </w:tcPr>
           <w:p>
             <w:pPr>
@@ -1557,7 +1567,7 @@
                 <w:sz w:val="20"/>
                 <w:szCs w:val="20"/>
               </w:rPr>
-              <w:t xml:space="preserve"/>
+              <w:t>✅</w:t>
             </w:r>
           </w:p>
         </w:tc>
@@ -2638,6 +2648,7 @@
         <w:tc>
           <w:tcPr>
             <w:vAlign w:val="center"/>
+            <w:shd w:val="solid" w:color="D4EDDA" w:fill="auto"/>
           </w:tcPr>
           <w:p>
             <w:r>
@@ -2654,6 +2665,7 @@
         <w:tc>
           <w:tcPr>
             <w:vAlign w:val="center"/>
+            <w:shd w:val="solid" w:color="D4EDDA" w:fill="auto"/>
           </w:tcPr>
           <w:p>
             <w:r>
@@ -2670,6 +2682,7 @@
         <w:tc>
           <w:tcPr>
             <w:vAlign w:val="center"/>
+            <w:shd w:val="solid" w:color="D4EDDA" w:fill="auto"/>
           </w:tcPr>
           <w:p>
             <w:r>
@@ -2686,6 +2699,7 @@
         <w:tc>
           <w:tcPr>
             <w:vAlign w:val="center"/>
+            <w:shd w:val="solid" w:color="D4EDDA" w:fill="auto"/>
           </w:tcPr>
           <w:p>
             <w:r>
@@ -2702,6 +2716,7 @@
         <w:tc>
           <w:tcPr>
             <w:vAlign w:val="center"/>
+            <w:shd w:val="solid" w:color="D4EDDA" w:fill="auto"/>
           </w:tcPr>
           <w:p>
             <w:pPr>
@@ -2713,7 +2728,7 @@
                 <w:sz w:val="20"/>
                 <w:szCs w:val="20"/>
               </w:rPr>
-              <w:t xml:space="preserve"/>
+              <w:t>✅</w:t>
             </w:r>
           </w:p>
         </w:tc>
@@ -2984,6 +2999,7 @@
         <w:tc>
           <w:tcPr>
             <w:vAlign w:val="center"/>
+            <w:shd w:val="solid" w:color="D4EDDA" w:fill="auto"/>
           </w:tcPr>
           <w:p>
             <w:r>
@@ -3000,6 +3016,7 @@
         <w:tc>
           <w:tcPr>
             <w:vAlign w:val="center"/>
+            <w:shd w:val="solid" w:color="D4EDDA" w:fill="auto"/>
           </w:tcPr>
           <w:p>
             <w:r>
@@ -3016,6 +3033,7 @@
         <w:tc>
           <w:tcPr>
             <w:vAlign w:val="center"/>
+            <w:shd w:val="solid" w:color="D4EDDA" w:fill="auto"/>
           </w:tcPr>
           <w:p>
             <w:r>
@@ -3032,6 +3050,7 @@
         <w:tc>
           <w:tcPr>
             <w:vAlign w:val="center"/>
+            <w:shd w:val="solid" w:color="D4EDDA" w:fill="auto"/>
           </w:tcPr>
           <w:p>
             <w:r>
@@ -3048,6 +3067,7 @@
         <w:tc>
           <w:tcPr>
             <w:vAlign w:val="center"/>
+            <w:shd w:val="solid" w:color="D4EDDA" w:fill="auto"/>
           </w:tcPr>
           <w:p>
             <w:pPr>
@@ -3059,7 +3079,7 @@
                 <w:sz w:val="20"/>
                 <w:szCs w:val="20"/>
               </w:rPr>
-              <w:t xml:space="preserve"/>
+              <w:t>✅</w:t>
             </w:r>
           </w:p>
         </w:tc>
@@ -3487,7 +3507,7 @@
                 <w:sz w:val="20"/>
                 <w:szCs w:val="20"/>
               </w:rPr>
-              <w:t xml:space="preserve">3 tasks</w:t>
+              <w:t>3 tasks (3 done)</w:t>
             </w:r>
           </w:p>
         </w:tc>
@@ -3746,7 +3766,7 @@
                 <w:sz w:val="20"/>
                 <w:szCs w:val="20"/>
               </w:rPr>
-              <w:t>6 tasks</w:t>
+              <w:t>6 tasks (2 done)</w:t>
             </w:r>
           </w:p>
         </w:tc>

</xml_diff>

<commit_message>
Remove background from character images on landing page
Task 18: Remove square backgrounds from Luno, Lumi, Lolo, Lottie
landing page images. Used rembg for Luno/Lolo, remove.bg for
Lumi/Lottie (same-color backgrounds). Also processed luno-hero.png.
</commit_message>
<xml_diff>
--- a/docs/Yoluno_Development_Roadmap.docx
+++ b/docs/Yoluno_Development_Roadmap.docx
@@ -2736,8 +2736,8 @@
       <w:tr>
         <w:tc>
           <w:tcPr>
-            <w:shd w:color="F5F4F2" w:val="solid"/>
-            <w:vAlign w:val="center"/>
+            <w:vAlign w:val="center"/>
+            <w:shd w:val="solid" w:color="D4EDDA" w:fill="auto"/>
           </w:tcPr>
           <w:p>
             <w:r>
@@ -2753,8 +2753,8 @@
         </w:tc>
         <w:tc>
           <w:tcPr>
-            <w:shd w:color="F5F4F2" w:val="solid"/>
-            <w:vAlign w:val="center"/>
+            <w:vAlign w:val="center"/>
+            <w:shd w:val="solid" w:color="D4EDDA" w:fill="auto"/>
           </w:tcPr>
           <w:p>
             <w:r>
@@ -2770,8 +2770,8 @@
         </w:tc>
         <w:tc>
           <w:tcPr>
-            <w:shd w:color="F5F4F2" w:val="solid"/>
-            <w:vAlign w:val="center"/>
+            <w:vAlign w:val="center"/>
+            <w:shd w:val="solid" w:color="D4EDDA" w:fill="auto"/>
           </w:tcPr>
           <w:p>
             <w:r>
@@ -2787,8 +2787,8 @@
         </w:tc>
         <w:tc>
           <w:tcPr>
-            <w:shd w:color="F5F4F2" w:val="solid"/>
-            <w:vAlign w:val="center"/>
+            <w:vAlign w:val="center"/>
+            <w:shd w:val="solid" w:color="D4EDDA" w:fill="auto"/>
           </w:tcPr>
           <w:p>
             <w:r>
@@ -2804,8 +2804,8 @@
         </w:tc>
         <w:tc>
           <w:tcPr>
-            <w:shd w:color="F5F4F2" w:val="solid"/>
-            <w:vAlign w:val="center"/>
+            <w:vAlign w:val="center"/>
+            <w:shd w:val="solid" w:color="D4EDDA" w:fill="auto"/>
           </w:tcPr>
           <w:p>
             <w:pPr>
@@ -2817,7 +2817,7 @@
                 <w:sz w:val="20"/>
                 <w:szCs w:val="20"/>
               </w:rPr>
-              <w:t xml:space="preserve"/>
+              <w:t>✅</w:t>
             </w:r>
           </w:p>
         </w:tc>
@@ -3766,7 +3766,7 @@
                 <w:sz w:val="20"/>
                 <w:szCs w:val="20"/>
               </w:rPr>
-              <w:t>6 tasks (2 done)</w:t>
+              <w:t>6 tasks (3 done)</w:t>
             </w:r>
           </w:p>
         </w:tc>

</xml_diff>

<commit_message>
Update kids dashboard color scheme and journey styling
Task 25: Character-themed backgrounds for kids mode pages.
Chat = teal (Luno), Journeys = orange (Lolo), Family = gold (Lottie).
Journey cards, tabs, progress bars, detail page all use Lolo orange.
Family tree cards use warm yellow with amber badges.
Parent journey button changed from Continue to View (stays on dashboard).
Create Journey button follows orange color scheme.
</commit_message>
<xml_diff>
--- a/docs/Yoluno_Development_Roadmap.docx
+++ b/docs/Yoluno_Development_Roadmap.docx
@@ -2071,6 +2071,90 @@
           </w:p>
         </w:tc>
       </w:tr>
+      <w:tr>
+        <w:tc>
+          <w:tcPr>
+            <w:vAlign w:val="center"/>
+          </w:tcPr>
+          <w:p>
+            <w:r>
+              <w:rPr>
+                <w:rFonts w:ascii="Segoe UI" w:cs="Segoe UI" w:eastAsia="Segoe UI" w:hAnsi="Segoe UI"/>
+                <w:color w:val="2D2A26"/>
+                <w:sz w:val="20"/>
+                <w:szCs w:val="20"/>
+              </w:rPr>
+              <w:t xml:space="preserve">26</w:t>
+            </w:r>
+          </w:p>
+        </w:tc>
+        <w:tc>
+          <w:tcPr>
+            <w:vAlign w:val="center"/>
+          </w:tcPr>
+          <w:p>
+            <w:r>
+              <w:rPr>
+                <w:rFonts w:ascii="Segoe UI" w:cs="Segoe UI" w:eastAsia="Segoe UI" w:hAnsi="Segoe UI"/>
+                <w:color w:val="2D2A26"/>
+                <w:sz w:val="20"/>
+                <w:szCs w:val="20"/>
+              </w:rPr>
+              <w:t xml:space="preserve">Family Voice Narration</w:t>
+            </w:r>
+          </w:p>
+        </w:tc>
+        <w:tc>
+          <w:tcPr>
+            <w:vAlign w:val="center"/>
+          </w:tcPr>
+          <w:p>
+            <w:r>
+              <w:rPr>
+                <w:rFonts w:ascii="Segoe UI" w:cs="Segoe UI" w:eastAsia="Segoe UI" w:hAnsi="Segoe UI"/>
+                <w:color w:val="2D2A26"/>
+                <w:sz w:val="20"/>
+                <w:szCs w:val="20"/>
+              </w:rPr>
+              <w:t xml:space="preserve">Clone family member voices from Voice Vault using ElevenLabs AI so kids can hear stories read in familiar voices</w:t>
+            </w:r>
+          </w:p>
+        </w:tc>
+        <w:tc>
+          <w:tcPr>
+            <w:vAlign w:val="center"/>
+          </w:tcPr>
+          <w:p>
+            <w:r>
+              <w:rPr>
+                <w:rFonts w:ascii="Segoe UI" w:cs="Segoe UI" w:eastAsia="Segoe UI" w:hAnsi="Segoe UI"/>
+                <w:color w:val="2D2A26"/>
+                <w:sz w:val="20"/>
+                <w:szCs w:val="20"/>
+              </w:rPr>
+              <w:t xml:space="preserve">6-8 hr</w:t>
+            </w:r>
+          </w:p>
+        </w:tc>
+        <w:tc>
+          <w:tcPr>
+            <w:vAlign w:val="center"/>
+          </w:tcPr>
+          <w:p>
+            <w:pPr>
+              <w:jc w:val="center"/>
+            </w:pPr>
+            <w:r>
+              <w:rPr>
+                <w:rFonts w:ascii="Segoe UI" w:cs="Segoe UI" w:eastAsia="Segoe UI" w:hAnsi="Segoe UI"/>
+                <w:sz w:val="20"/>
+                <w:szCs w:val="20"/>
+              </w:rPr>
+              <w:t xml:space="preserve"/>
+            </w:r>
+          </w:p>
+        </w:tc>
+      </w:tr>
     </w:tbl>
     <w:p>
       <w:pPr>
@@ -3088,6 +3172,7 @@
         <w:tc>
           <w:tcPr>
             <w:vAlign w:val="center"/>
+            <w:shd w:val="solid" w:color="D4EDDA" w:fill="auto"/>
           </w:tcPr>
           <w:p>
             <w:r>
@@ -3104,6 +3189,7 @@
         <w:tc>
           <w:tcPr>
             <w:vAlign w:val="center"/>
+            <w:shd w:val="solid" w:color="D4EDDA" w:fill="auto"/>
           </w:tcPr>
           <w:p>
             <w:r>
@@ -3120,6 +3206,7 @@
         <w:tc>
           <w:tcPr>
             <w:vAlign w:val="center"/>
+            <w:shd w:val="solid" w:color="D4EDDA" w:fill="auto"/>
           </w:tcPr>
           <w:p>
             <w:r>
@@ -3136,6 +3223,7 @@
         <w:tc>
           <w:tcPr>
             <w:vAlign w:val="center"/>
+            <w:shd w:val="solid" w:color="D4EDDA" w:fill="auto"/>
           </w:tcPr>
           <w:p>
             <w:r>
@@ -3152,6 +3240,7 @@
         <w:tc>
           <w:tcPr>
             <w:vAlign w:val="center"/>
+            <w:shd w:val="solid" w:color="D4EDDA" w:fill="auto"/>
           </w:tcPr>
           <w:p>
             <w:pPr>
@@ -3163,7 +3252,7 @@
                 <w:sz w:val="20"/>
                 <w:szCs w:val="20"/>
               </w:rPr>
-              <w:t xml:space="preserve"/>
+              <w:t>✅</w:t>
             </w:r>
           </w:p>
         </w:tc>
@@ -3593,7 +3682,7 @@
                 <w:sz w:val="20"/>
                 <w:szCs w:val="20"/>
               </w:rPr>
-              <w:t xml:space="preserve">4 tasks</w:t>
+              <w:t>5 tasks</w:t>
             </w:r>
           </w:p>
         </w:tc>
@@ -3766,7 +3855,7 @@
                 <w:sz w:val="20"/>
                 <w:szCs w:val="20"/>
               </w:rPr>
-              <w:t>6 tasks (3 done)</w:t>
+              <w:t>6 tasks (4 done)</w:t>
             </w:r>
           </w:p>
         </w:tc>

</xml_diff>

<commit_message>
Implement multi-media family profiles and family notifications
Task 1: Multiple photos per family member with carousel navigation.
New family_member_photos table, API endpoints, parent UI for adding
memory photos, kids UI photo carousel with arrows and timestamps.
Unified stories input (removed duplicate funFacts field).

Task 2: Family notifications for kids. Notify children when parent
adds new members, photos, videos, or stories. Smart throttle skips
media notifications during initial member creation. Luno chat gets
recent family updates context for proactive mentions via Lottie.
</commit_message>
<xml_diff>
--- a/docs/Yoluno_Development_Roadmap.docx
+++ b/docs/Yoluno_Development_Roadmap.docx
@@ -1729,6 +1729,7 @@
         <w:tc>
           <w:tcPr>
             <w:vAlign w:val="center"/>
+            <w:shd w:val="solid" w:color="D4EDDA" w:fill="auto"/>
           </w:tcPr>
           <w:p>
             <w:r>
@@ -1745,6 +1746,7 @@
         <w:tc>
           <w:tcPr>
             <w:vAlign w:val="center"/>
+            <w:shd w:val="solid" w:color="D4EDDA" w:fill="auto"/>
           </w:tcPr>
           <w:p>
             <w:r>
@@ -1761,6 +1763,7 @@
         <w:tc>
           <w:tcPr>
             <w:vAlign w:val="center"/>
+            <w:shd w:val="solid" w:color="D4EDDA" w:fill="auto"/>
           </w:tcPr>
           <w:p>
             <w:r>
@@ -1777,6 +1780,7 @@
         <w:tc>
           <w:tcPr>
             <w:vAlign w:val="center"/>
+            <w:shd w:val="solid" w:color="D4EDDA" w:fill="auto"/>
           </w:tcPr>
           <w:p>
             <w:r>
@@ -1793,6 +1797,7 @@
         <w:tc>
           <w:tcPr>
             <w:vAlign w:val="center"/>
+            <w:shd w:val="solid" w:color="D4EDDA" w:fill="auto"/>
           </w:tcPr>
           <w:p>
             <w:pPr>
@@ -1804,7 +1809,7 @@
                 <w:sz w:val="20"/>
                 <w:szCs w:val="20"/>
               </w:rPr>
-              <w:t xml:space="preserve"/>
+              <w:t>✅</w:t>
             </w:r>
           </w:p>
         </w:tc>
@@ -1812,8 +1817,8 @@
       <w:tr>
         <w:tc>
           <w:tcPr>
-            <w:shd w:color="F5F4F2" w:val="solid"/>
-            <w:vAlign w:val="center"/>
+            <w:vAlign w:val="center"/>
+            <w:shd w:val="solid" w:color="D4EDDA" w:fill="auto"/>
           </w:tcPr>
           <w:p>
             <w:r>
@@ -1829,8 +1834,8 @@
         </w:tc>
         <w:tc>
           <w:tcPr>
-            <w:shd w:color="F5F4F2" w:val="solid"/>
-            <w:vAlign w:val="center"/>
+            <w:vAlign w:val="center"/>
+            <w:shd w:val="solid" w:color="D4EDDA" w:fill="auto"/>
           </w:tcPr>
           <w:p>
             <w:r>
@@ -1846,8 +1851,8 @@
         </w:tc>
         <w:tc>
           <w:tcPr>
-            <w:shd w:color="F5F4F2" w:val="solid"/>
-            <w:vAlign w:val="center"/>
+            <w:vAlign w:val="center"/>
+            <w:shd w:val="solid" w:color="D4EDDA" w:fill="auto"/>
           </w:tcPr>
           <w:p>
             <w:r>
@@ -1863,8 +1868,8 @@
         </w:tc>
         <w:tc>
           <w:tcPr>
-            <w:shd w:color="F5F4F2" w:val="solid"/>
-            <w:vAlign w:val="center"/>
+            <w:vAlign w:val="center"/>
+            <w:shd w:val="solid" w:color="D4EDDA" w:fill="auto"/>
           </w:tcPr>
           <w:p>
             <w:r>
@@ -1880,8 +1885,8 @@
         </w:tc>
         <w:tc>
           <w:tcPr>
-            <w:shd w:color="F5F4F2" w:val="solid"/>
-            <w:vAlign w:val="center"/>
+            <w:vAlign w:val="center"/>
+            <w:shd w:val="solid" w:color="D4EDDA" w:fill="auto"/>
           </w:tcPr>
           <w:p>
             <w:pPr>
@@ -1893,7 +1898,7 @@
                 <w:sz w:val="20"/>
                 <w:szCs w:val="20"/>
               </w:rPr>
-              <w:t xml:space="preserve"/>
+              <w:t>✅</w:t>
             </w:r>
           </w:p>
         </w:tc>
@@ -2993,8 +2998,8 @@
       <w:tr>
         <w:tc>
           <w:tcPr>
-            <w:shd w:color="F5F4F2" w:val="solid"/>
-            <w:vAlign w:val="center"/>
+            <w:vAlign w:val="center"/>
+            <w:shd w:val="solid" w:color="D4EDDA" w:fill="auto"/>
           </w:tcPr>
           <w:p>
             <w:r>
@@ -3010,8 +3015,8 @@
         </w:tc>
         <w:tc>
           <w:tcPr>
-            <w:shd w:color="F5F4F2" w:val="solid"/>
-            <w:vAlign w:val="center"/>
+            <w:vAlign w:val="center"/>
+            <w:shd w:val="solid" w:color="D4EDDA" w:fill="auto"/>
           </w:tcPr>
           <w:p>
             <w:r>
@@ -3027,8 +3032,8 @@
         </w:tc>
         <w:tc>
           <w:tcPr>
-            <w:shd w:color="F5F4F2" w:val="solid"/>
-            <w:vAlign w:val="center"/>
+            <w:vAlign w:val="center"/>
+            <w:shd w:val="solid" w:color="D4EDDA" w:fill="auto"/>
           </w:tcPr>
           <w:p>
             <w:r>
@@ -3044,8 +3049,8 @@
         </w:tc>
         <w:tc>
           <w:tcPr>
-            <w:shd w:color="F5F4F2" w:val="solid"/>
-            <w:vAlign w:val="center"/>
+            <w:vAlign w:val="center"/>
+            <w:shd w:val="solid" w:color="D4EDDA" w:fill="auto"/>
           </w:tcPr>
           <w:p>
             <w:r>
@@ -3061,8 +3066,8 @@
         </w:tc>
         <w:tc>
           <w:tcPr>
-            <w:shd w:color="F5F4F2" w:val="solid"/>
-            <w:vAlign w:val="center"/>
+            <w:vAlign w:val="center"/>
+            <w:shd w:val="solid" w:color="D4EDDA" w:fill="auto"/>
           </w:tcPr>
           <w:p>
             <w:pPr>
@@ -3074,7 +3079,7 @@
                 <w:sz w:val="20"/>
                 <w:szCs w:val="20"/>
               </w:rPr>
-              <w:t xml:space="preserve"/>
+              <w:t>✅</w:t>
             </w:r>
           </w:p>
         </w:tc>
@@ -3682,7 +3687,7 @@
                 <w:sz w:val="20"/>
                 <w:szCs w:val="20"/>
               </w:rPr>
-              <w:t>5 tasks</w:t>
+              <w:t>5 tasks (2 done)</w:t>
             </w:r>
           </w:p>
         </w:tc>
@@ -3855,7 +3860,7 @@
                 <w:sz w:val="20"/>
                 <w:szCs w:val="20"/>
               </w:rPr>
-              <w:t>6 tasks (4 done)</w:t>
+              <w:t>6 tasks (5 done)</w:t>
             </w:r>
           </w:p>
         </w:tc>

</xml_diff>

<commit_message>
Add step-parent relationship types to family tree
Task 17: Add step-father and step-mother as selectable relationship
types. Step-parents appear in the Parents generation on both parent
dashboard tree and kids family view. Updated form, tree canvas,
node labels, connection descriptions, and kids page grouping.
</commit_message>
<xml_diff>
--- a/docs/Yoluno_Development_Roadmap.docx
+++ b/docs/Yoluno_Development_Roadmap.docx
@@ -1990,8 +1990,8 @@
       <w:tr>
         <w:tc>
           <w:tcPr>
-            <w:shd w:color="F5F4F2" w:val="solid"/>
-            <w:vAlign w:val="center"/>
+            <w:vAlign w:val="center"/>
+            <w:shd w:val="solid" w:color="D4EDDA" w:fill="auto"/>
           </w:tcPr>
           <w:p>
             <w:r>
@@ -2007,8 +2007,8 @@
         </w:tc>
         <w:tc>
           <w:tcPr>
-            <w:shd w:color="F5F4F2" w:val="solid"/>
-            <w:vAlign w:val="center"/>
+            <w:vAlign w:val="center"/>
+            <w:shd w:val="solid" w:color="D4EDDA" w:fill="auto"/>
           </w:tcPr>
           <w:p>
             <w:r>
@@ -2024,8 +2024,8 @@
         </w:tc>
         <w:tc>
           <w:tcPr>
-            <w:shd w:color="F5F4F2" w:val="solid"/>
-            <w:vAlign w:val="center"/>
+            <w:vAlign w:val="center"/>
+            <w:shd w:val="solid" w:color="D4EDDA" w:fill="auto"/>
           </w:tcPr>
           <w:p>
             <w:r>
@@ -2041,8 +2041,8 @@
         </w:tc>
         <w:tc>
           <w:tcPr>
-            <w:shd w:color="F5F4F2" w:val="solid"/>
-            <w:vAlign w:val="center"/>
+            <w:vAlign w:val="center"/>
+            <w:shd w:val="solid" w:color="D4EDDA" w:fill="auto"/>
           </w:tcPr>
           <w:p>
             <w:r>
@@ -2058,8 +2058,8 @@
         </w:tc>
         <w:tc>
           <w:tcPr>
-            <w:shd w:color="F5F4F2" w:val="solid"/>
-            <w:vAlign w:val="center"/>
+            <w:vAlign w:val="center"/>
+            <w:shd w:val="solid" w:color="D4EDDA" w:fill="auto"/>
           </w:tcPr>
           <w:p>
             <w:pPr>
@@ -2071,7 +2071,7 @@
                 <w:sz w:val="20"/>
                 <w:szCs w:val="20"/>
               </w:rPr>
-              <w:t xml:space="preserve"/>
+              <w:t>✅</w:t>
             </w:r>
           </w:p>
         </w:tc>
@@ -3687,7 +3687,7 @@
                 <w:sz w:val="20"/>
                 <w:szCs w:val="20"/>
               </w:rPr>
-              <w:t>5 tasks (2 done)</w:t>
+              <w:t>5 tasks (3 done)</w:t>
             </w:r>
           </w:p>
         </w:tc>

</xml_diff>